<commit_message>
docs(docs): update the consolidated documentation
RF0006 e a linha de interfaces de autenticação passam a "implementado": as quatro
rotas de ambiente existem nas duas plataformas, com tela própria por papel e teste de
comportamento. RF0015 continua previsto — a recuperação de senha tem rota, não tem
envio, porque o contrato de API não existe.

Co-Authored-By: Claude Opus 5 <noreply@anthropic.com>
</commit_message>
<xml_diff>
--- a/documentacao_habituar.docx
+++ b/documentacao_habituar.docx
@@ -2104,7 +2104,7 @@
             </w:pPr>
             <w:r>
               <w:rPr/>
-              <w:t>Em desenvolvimento</w:t>
+              <w:t>Implementado</w:t>
             </w:r>
           </w:p>
         </w:tc>
@@ -2126,7 +2126,7 @@
             </w:pPr>
             <w:r>
               <w:rPr/>
-              <w:t>Próxima</w:t>
+              <w:t>Atual</w:t>
             </w:r>
           </w:p>
         </w:tc>
@@ -10566,7 +10566,7 @@
             </w:pPr>
             <w:r>
               <w:rPr/>
-              <w:t>Em desenvolvimento</w:t>
+              <w:t>Implementado</w:t>
             </w:r>
           </w:p>
         </w:tc>
@@ -10588,7 +10588,7 @@
             </w:pPr>
             <w:r>
               <w:rPr/>
-              <w:t>Login, cadastro e direcionamento por perfil</w:t>
+              <w:t>Entrada, cadastro e ambientes por perfil na web e no mobile</w:t>
             </w:r>
           </w:p>
         </w:tc>

</xml_diff>

<commit_message>
docs(docs): document membership roles and institution onboarding
</commit_message>
<xml_diff>
--- a/documentacao_habituar.docx
+++ b/documentacao_habituar.docx
@@ -747,7 +747,7 @@
             </w:pPr>
             <w:r>
               <w:rPr/>
-              <w:t>A pessoa deve poder criar uma conta com nome, e-mail e senha válidos.</w:t>
+              <w:t>A pessoa deve poder criar uma conta com nome, e-mail e senha válidos. O acesso a uma instituição depende de convite; quem tem conta sem vínculo vê o estado de espera.</w:t>
             </w:r>
           </w:p>
         </w:tc>
@@ -948,7 +948,7 @@
             </w:pPr>
             <w:r>
               <w:rPr/>
-              <w:t>Implementado</w:t>
+              <w:t>Em desenvolvimento</w:t>
             </w:r>
           </w:p>
         </w:tc>
@@ -1325,7 +1325,7 @@
             </w:pPr>
             <w:r>
               <w:rPr/>
-              <w:t>Após autenticar, o sistema deve identificar usuário, instituições disponíveis, papel e ambiente de destino.</w:t>
+              <w:t>Após autenticar, o sistema deve identificar usuário, instituições disponíveis, tipo de vínculo, papéis acumulados e permissões efetivas. Quando há mais de um vínculo, a pessoa pode trocar de instituição sem sair; o cliente lembra a última escolha.</w:t>
             </w:r>
           </w:p>
         </w:tc>
@@ -1526,7 +1526,7 @@
             </w:pPr>
             <w:r>
               <w:rPr/>
-              <w:t>Implementado</w:t>
+              <w:t>Em desenvolvimento</w:t>
             </w:r>
           </w:p>
         </w:tc>
@@ -2104,7 +2104,7 @@
             </w:pPr>
             <w:r>
               <w:rPr/>
-              <w:t>Implementado</w:t>
+              <w:t>Em desenvolvimento</w:t>
             </w:r>
           </w:p>
         </w:tc>
@@ -2192,7 +2192,7 @@
             </w:pPr>
             <w:r>
               <w:rPr/>
-              <w:t>A instituição deve controlar papéis, permissões e alcances de acesso sem permitir escalonamento indevido.</w:t>
+              <w:t>A instituição deve controlar papéis, permissões e alcances de acesso sem permitir escalonamento indevido. Cada vínculo tem um tipo (aluno, profissional ou monitor), pode receber vários papéis compatíveis e soma suas concessões. Os cinco papéis iniciais são Gestão da equipe, atendimento a vinculados, atendimento institucional, monitoramento e aluno. A interface de gestão de papéis e membros ainda está prevista.</w:t>
             </w:r>
           </w:p>
         </w:tc>
@@ -2393,7 +2393,7 @@
             </w:pPr>
             <w:r>
               <w:rPr/>
-              <w:t>Implementado no servidor</w:t>
+              <w:t>Em desenvolvimento</w:t>
             </w:r>
           </w:p>
         </w:tc>
@@ -4215,7 +4215,7 @@
             </w:pPr>
             <w:r>
               <w:rPr/>
-              <w:t>O administrador geral deve criar e manter instituições sem acesso implícito aos dados sensíveis delas.</w:t>
+              <w:t>O administrador geral deve criar e manter instituições sem acesso implícito aos dados sensíveis delas. Na web, informa CPF ou CNPJ válido e contato, vê membros e papéis, convida pessoas, revoga convites e entrega um link que aparece uma vez. A pessoa aceita na web com conta nova ou existente; o convite expira em sete dias.</w:t>
             </w:r>
           </w:p>
         </w:tc>
@@ -4416,7 +4416,7 @@
             </w:pPr>
             <w:r>
               <w:rPr/>
-              <w:t>Parcial</w:t>
+              <w:t>Em desenvolvimento</w:t>
             </w:r>
           </w:p>
         </w:tc>
@@ -8128,7 +8128,7 @@
       </w:pPr>
       <w:r>
         <w:rPr/>
-        <w:t>O modelo abaixo representa as entidades atualmente implementadas. Usuários e sessões são globais; vínculos, papéis, permissões, estudantes, responsáveis e atribuições preservam o contexto institucional. O banco aplica isolamento por linha para impedir acesso entre instituições.</w:t>
+        <w:t>O modelo abaixo representa as entidades atualmente implementadas. Usuários e sessões são globais; vínculos, papéis, permissões, convites, estudantes, responsáveis e atribuições preservam o contexto institucional. Cada vínculo possui um tipo e recebe papéis por membership_roles; os papéis de sistema possuem template_key. Convites guardam somente o hash do token e seus papéis ficam em invitation_roles. O banco aplica isolamento por linha para impedir acesso entre instituições.</w:t>
       </w:r>
     </w:p>
     <w:p>
@@ -10475,7 +10475,7 @@
             </w:pPr>
             <w:r>
               <w:rPr/>
-              <w:t>Implementado no servidor</w:t>
+              <w:t>Em desenvolvimento</w:t>
             </w:r>
           </w:p>
         </w:tc>
@@ -10497,7 +10497,98 @@
             </w:pPr>
             <w:r>
               <w:rPr/>
-              <w:t>Catálogo fechado e isolamento institucional</w:t>
+              <w:t>Papéis somados, catálogo fechado e isolamento institucional</w:t>
+            </w:r>
+          </w:p>
+        </w:tc>
+      </w:tr>
+      <w:tr>
+        <w:trPr/>
+        <w:tc>
+          <w:tcPr>
+            <w:tcW w:w="2953" w:type="dxa"/>
+            <w:tcBorders>
+              <w:top w:val="single" w:sz="4" w:space="0" w:color="000001"/>
+              <w:start w:val="single" w:sz="4" w:space="0" w:color="000001"/>
+              <w:bottom w:val="single" w:sz="4" w:space="0" w:color="000001"/>
+              <w:end w:val="single" w:sz="4" w:space="0" w:color="000001"/>
+            </w:tcBorders>
+            <w:shd w:fill="auto" w:val="clear"/>
+          </w:tcPr>
+          <w:p>
+            <w:pPr>
+              <w:pStyle w:val="normal1"/>
+              <w:rPr/>
+            </w:pPr>
+            <w:r>
+              <w:rPr/>
+              <w:t>Instituições e convites</w:t>
+            </w:r>
+          </w:p>
+        </w:tc>
+        <w:tc>
+          <w:tcPr>
+            <w:tcW w:w="2370" w:type="dxa"/>
+            <w:tcBorders>
+              <w:top w:val="single" w:sz="4" w:space="0" w:color="000001"/>
+              <w:start w:val="single" w:sz="4" w:space="0" w:color="000001"/>
+              <w:bottom w:val="single" w:sz="4" w:space="0" w:color="000001"/>
+              <w:end w:val="single" w:sz="4" w:space="0" w:color="000001"/>
+            </w:tcBorders>
+            <w:shd w:fill="auto" w:val="clear"/>
+          </w:tcPr>
+          <w:p>
+            <w:pPr>
+              <w:pStyle w:val="normal1"/>
+              <w:rPr/>
+            </w:pPr>
+            <w:r>
+              <w:rPr/>
+              <w:t>Média</w:t>
+            </w:r>
+          </w:p>
+        </w:tc>
+        <w:tc>
+          <w:tcPr>
+            <w:tcW w:w="2460" w:type="dxa"/>
+            <w:tcBorders>
+              <w:top w:val="single" w:sz="4" w:space="0" w:color="000001"/>
+              <w:start w:val="single" w:sz="4" w:space="0" w:color="000001"/>
+              <w:bottom w:val="single" w:sz="4" w:space="0" w:color="000001"/>
+              <w:end w:val="single" w:sz="4" w:space="0" w:color="000001"/>
+            </w:tcBorders>
+            <w:shd w:fill="auto" w:val="clear"/>
+          </w:tcPr>
+          <w:p>
+            <w:pPr>
+              <w:pStyle w:val="normal1"/>
+              <w:rPr/>
+            </w:pPr>
+            <w:r>
+              <w:rPr/>
+              <w:t>Em desenvolvimento</w:t>
+            </w:r>
+          </w:p>
+        </w:tc>
+        <w:tc>
+          <w:tcPr>
+            <w:tcW w:w="2419" w:type="dxa"/>
+            <w:tcBorders>
+              <w:top w:val="single" w:sz="4" w:space="0" w:color="000001"/>
+              <w:start w:val="single" w:sz="4" w:space="0" w:color="000001"/>
+              <w:bottom w:val="single" w:sz="4" w:space="0" w:color="000001"/>
+              <w:end w:val="single" w:sz="4" w:space="0" w:color="000001"/>
+            </w:tcBorders>
+            <w:shd w:fill="auto" w:val="clear"/>
+          </w:tcPr>
+          <w:p>
+            <w:pPr>
+              <w:pStyle w:val="normal1"/>
+              <w:rPr/>
+            </w:pPr>
+            <w:r>
+              <w:rPr/>
+              <w:t>Cadastro, convite de uso único e aceite na web</w:t>
             </w:r>
           </w:p>
         </w:tc>

</xml_diff>

<commit_message>
docs(docs): document staff management, roles and permissions
</commit_message>
<xml_diff>
--- a/documentacao_habituar.docx
+++ b/documentacao_habituar.docx
@@ -1903,7 +1903,7 @@
             </w:pPr>
             <w:r>
               <w:rPr/>
-              <w:t>A interface deve encaminhar aluno, profissional, monitor e administrador geral ao ambiente correspondente, mantendo profissional e monitor na mesma tela institucional.</w:t>
+              <w:t>A interface deve encaminhar aluno, profissional, monitor e administrador geral ao ambiente correspondente. Profissional e monitor usam o mesmo ambiente profissional, com destinos definidos pelas permissões atuais do vínculo; o endereço antigo do monitor leva a esse ambiente, e endereços digitados diretamente continuam protegidos. Quem perde o vínculo volta à escolha de instituição, a outro vínculo ou à espera por convite, sem dados da instituição anterior no dispositivo.</w:t>
             </w:r>
           </w:p>
         </w:tc>
@@ -2192,7 +2192,7 @@
             </w:pPr>
             <w:r>
               <w:rPr/>
-              <w:t>A instituição deve controlar papéis, permissões e alcances de acesso sem permitir escalonamento indevido. Cada vínculo tem um tipo (aluno, profissional ou monitor), pode receber vários papéis compatíveis e soma suas concessões. Os cinco papéis iniciais são Gestão da equipe, atendimento a vinculados, atendimento institucional, monitoramento e aluno. A interface de gestão de papéis e membros ainda está prevista.</w:t>
+              <w:t>A instituição deve controlar papéis, permissões e alcances de acesso sem permitir escalonamento indevido. Cada vínculo tem um tipo (aluno, profissional ou monitor), pode receber vários papéis compatíveis e soma suas concessões. Os cinco papéis iniciais são Gestão da equipe, atendimento a vinculados, atendimento institucional, monitoramento e aluno. Na seção Gestão, na web e no mobile, quem pode consultar a equipe lista e busca profissionais e monitores, convida, reenvia e revoga convites, substitui o conjunto de papéis de um membro, remove vínculos com confirmação e cria papéis personalizados a partir de um modelo do sistema, escolhendo agrupamentos de permissões com nome e alcance. Ninguém concede o que não possui, modelos do sistema não mudam, a instituição não fica sem gestão completa da equipe e a mudança de um papel mostra antes o impacto sobre membros e convites. A trilha completa de auditoria dessas mudanças ainda está prevista.</w:t>
             </w:r>
           </w:p>
         </w:tc>
@@ -4215,7 +4215,7 @@
             </w:pPr>
             <w:r>
               <w:rPr/>
-              <w:t>O administrador geral deve criar e manter instituições sem acesso implícito aos dados sensíveis delas. Na web, informa CPF ou CNPJ válido e contato, vê membros e papéis, convida pessoas, revoga convites e entrega um link que aparece uma vez. A pessoa aceita na web com conta nova ou existente; o convite expira em sete dias.</w:t>
+              <w:t>O administrador geral deve criar e manter instituições sem acesso implícito aos dados sensíveis delas. Na web, informa CPF ou CNPJ válido e contato, vê membros e papéis, convida pessoas, revoga convites e entrega um link que aparece uma vez. A pessoa aceita na web com conta nova ou existente; o convite expira em sete dias. Pela web, o administrador geral também configura equipe, convites e papéis da instituição com as mesmas regras, sem ganhar vínculo nem acesso a dados de alunos.</w:t>
             </w:r>
           </w:p>
         </w:tc>
@@ -8128,7 +8128,7 @@
       </w:pPr>
       <w:r>
         <w:rPr/>
-        <w:t>O modelo abaixo representa as entidades atualmente implementadas. Usuários e sessões são globais; vínculos, papéis, permissões, convites, estudantes, responsáveis e atribuições preservam o contexto institucional. Cada vínculo possui um tipo e recebe papéis por membership_roles; os papéis de sistema possuem template_key. Convites guardam somente o hash do token e seus papéis ficam em invitation_roles. O banco aplica isolamento por linha para impedir acesso entre instituições.</w:t>
+        <w:t>O modelo abaixo representa as entidades atualmente implementadas. Usuários e sessões são globais; vínculos, papéis, permissões, convites, estudantes, responsáveis e atribuições preservam o contexto institucional. Cada vínculo possui um tipo e recebe papéis por membership_roles; os papéis de sistema possuem template_key. Convites guardam somente o hash do token e seus papéis ficam em invitation_roles. Vínculos removidos recebem data e autor da remoção, sem apagar a conta nem a autoria de registros, e vínculos e papéis têm versão para recusar edição feita sobre dados desatualizados. O banco aplica isolamento por linha para impedir acesso entre instituições.</w:t>
       </w:r>
     </w:p>
     <w:p>
@@ -10497,7 +10497,7 @@
             </w:pPr>
             <w:r>
               <w:rPr/>
-              <w:t>Papéis somados, catálogo fechado e isolamento institucional</w:t>
+              <w:t>Papéis somados, catálogo fechado, isolamento institucional e gestão da equipe</w:t>
             </w:r>
           </w:p>
         </w:tc>

</xml_diff>

<commit_message>
docs(docs): document student record and student registration
Co-Authored-By: Claude Opus 5.5 <noreply@anthropic.com>
</commit_message>
<xml_diff>
--- a/documentacao_habituar.docx
+++ b/documentacao_habituar.docx
@@ -2481,7 +2481,7 @@
             </w:pPr>
             <w:r>
               <w:rPr/>
-              <w:t>O sistema deve relacionar profissionais ou monitores aos estudantes que acompanham.</w:t>
+              <w:t xml:space="preserve">O sistema deve relacionar profissionais ou monitores aos estudantes que acompanham. Quem gerencia acompanhamentos define, por estudante, as pessoas da equipe que o acompanham; só vínculos ativos de profissional ou monitor são aceitos, e remover alguém da instituição encerra os acompanhamentos dessa pessoa. A interface dessa definição ainda está prevista.</w:t>
             </w:r>
           </w:p>
         </w:tc>
@@ -2682,7 +2682,7 @@
             </w:pPr>
             <w:r>
               <w:rPr/>
-              <w:t>Implementado no servidor</w:t>
+              <w:t xml:space="preserve">Em desenvolvimento</w:t>
             </w:r>
           </w:p>
         </w:tc>
@@ -2770,7 +2770,7 @@
             </w:pPr>
             <w:r>
               <w:rPr/>
-              <w:t>Profissionais autorizados devem registrar dados, observações e histórico do estudante.</w:t>
+              <w:t xml:space="preserve">Profissionais autorizados devem registrar dados, observações e histórico do estudante. A ficha reúne turma, condições acompanhadas e necessidades de apoio; data de nascimento, nome social e responsáveis vêm do cadastro do estudante e aparecem na ficha para consulta. Cada gravação preserva a versão anterior, e observações não podem ser editadas nem apagadas. Na web e no aplicativo mobile, o profissional abre a ficha a partir da lista dos estudantes que acompanha, com busca por nome, e registra as consultas realizadas, com data, duração e anotação, que também não podem ser alteradas. A monitoria vê os estudantes que acompanha sem abrir a ficha, e estudante arquivado mantém a ficha apenas para consulta.</w:t>
             </w:r>
           </w:p>
         </w:tc>
@@ -2971,7 +2971,7 @@
             </w:pPr>
             <w:r>
               <w:rPr/>
-              <w:t>Previsto</w:t>
+              <w:t xml:space="preserve">Em desenvolvimento</w:t>
             </w:r>
           </w:p>
         </w:tc>
@@ -2993,7 +2993,7 @@
             </w:pPr>
             <w:r>
               <w:rPr/>
-              <w:t>Futura</w:t>
+              <w:t xml:space="preserve">Atual</w:t>
             </w:r>
           </w:p>
         </w:tc>
@@ -8128,7 +8128,7 @@
       </w:pPr>
       <w:r>
         <w:rPr/>
-        <w:t>O modelo abaixo representa as entidades atualmente implementadas. Usuários e sessões são globais; vínculos, papéis, permissões, convites, estudantes, responsáveis e atribuições preservam o contexto institucional. Cada vínculo possui um tipo e recebe papéis por membership_roles; os papéis de sistema possuem template_key. Convites guardam somente o hash do token e seus papéis ficam em invitation_roles. Vínculos removidos recebem data e autor da remoção, sem apagar a conta nem a autoria de registros, e vínculos e papéis têm versão para recusar edição feita sobre dados desatualizados. O banco aplica isolamento por linha para impedir acesso entre instituições.</w:t>
+        <w:t xml:space="preserve">O modelo abaixo representa as entidades atualmente implementadas. Usuários e sessões são globais; vínculos, papéis, permissões, convites, estudantes, responsáveis e atribuições preservam o contexto institucional. Cada vínculo possui um tipo e recebe papéis por membership_roles; os papéis de sistema possuem template_key. Convites guardam somente o hash do token e seus papéis ficam em invitation_roles. Vínculos removidos recebem data e autor da remoção, sem apagar a conta nem a autoria de registros, e vínculos e papéis têm versão para recusar edição feita sobre dados desatualizados. O estudante pode ser cadastrado sem conta própria; seus responsáveis ficam em student_guardians, os consentimentos em student_consents e cada acompanhamento liga um vínculo ativo de profissional ou monitor ao estudante. A ficha do estudante fica em student_profile_revisions, uma revisão por gravação, as observações em student_observations e as consultas realizadas em student_consultations; as três tabelas aceitam somente leitura e inserção, com autoria igual à pessoa autenticada. As tabelas de responsáveis, consentimentos e ficha ainda não aparecem no diagrama. O banco aplica isolamento por linha para impedir acesso entre instituições.</w:t>
       </w:r>
     </w:p>
     <w:p>
@@ -8196,7 +8196,7 @@
       </w:pPr>
       <w:r>
         <w:rPr/>
-        <w:t>Entidades previstas para evolução do produto incluem fichas, observações, rotina, tarefas, consultas, métricas, grupos e relatórios. Elas ainda não fazem parte do modelo físico apresentado.</w:t>
+        <w:t xml:space="preserve">Entidades previstas para evolução do produto incluem rotina, tarefas, agenda de consultas, métricas, grupos e relatórios. Elas ainda não fazem parte do modelo físico apresentado.</w:t>
       </w:r>
     </w:p>
     <w:p>
@@ -10748,7 +10748,7 @@
             </w:pPr>
             <w:r>
               <w:rPr/>
-              <w:t>Previsto</w:t>
+              <w:t xml:space="preserve">Em desenvolvimento</w:t>
             </w:r>
           </w:p>
         </w:tc>
@@ -10770,7 +10770,7 @@
             </w:pPr>
             <w:r>
               <w:rPr/>
-              <w:t>Dados sensíveis, histórico e auditoria</w:t>
+              <w:t xml:space="preserve">Dados de apoio, histórico e consultas realizadas; auditoria prevista</w:t>
             </w:r>
           </w:p>
         </w:tc>

</xml_diff>

<commit_message>
docs(docs): document sprint 1 and sprint 2 deliveries
Mark integrated requirements as implemented, redraw the database model
with the student tables and add the delivery schedule of both sprints.
</commit_message>
<xml_diff>
--- a/documentacao_habituar.docx
+++ b/documentacao_habituar.docx
@@ -948,7 +948,7 @@
             </w:pPr>
             <w:r>
               <w:rPr/>
-              <w:t>Em desenvolvimento</w:t>
+              <w:t>Implementado</w:t>
             </w:r>
           </w:p>
         </w:tc>
@@ -1526,7 +1526,7 @@
             </w:pPr>
             <w:r>
               <w:rPr/>
-              <w:t>Em desenvolvimento</w:t>
+              <w:t>Implementado</w:t>
             </w:r>
           </w:p>
         </w:tc>
@@ -2104,7 +2104,7 @@
             </w:pPr>
             <w:r>
               <w:rPr/>
-              <w:t>Em desenvolvimento</w:t>
+              <w:t>Implementado</w:t>
             </w:r>
           </w:p>
         </w:tc>
@@ -2393,7 +2393,7 @@
             </w:pPr>
             <w:r>
               <w:rPr/>
-              <w:t>Em desenvolvimento</w:t>
+              <w:t>Implementado</w:t>
             </w:r>
           </w:p>
         </w:tc>
@@ -2481,7 +2481,7 @@
             </w:pPr>
             <w:r>
               <w:rPr/>
-              <w:t xml:space="preserve">O sistema deve relacionar profissionais ou monitores aos estudantes que acompanham. Quem gerencia acompanhamentos define, por estudante, as pessoas da equipe que o acompanham; só vínculos ativos de profissional ou monitor são aceitos, e remover alguém da instituição encerra os acompanhamentos dessa pessoa. A interface dessa definição ainda está prevista.</w:t>
+              <w:t xml:space="preserve">O sistema deve relacionar profissionais ou monitores aos estudantes que acompanham. Quem gerencia acompanhamentos define, por estudante, as pessoas da equipe que o acompanham; só vínculos ativos de profissional ou monitor são aceitos, e remover alguém da instituição encerra os acompanhamentos dessa pessoa. Na web e no mobile, essa definição fica no detalhe do estudante, dentro da seção Gestão.</w:t>
             </w:r>
           </w:p>
         </w:tc>
@@ -2682,7 +2682,7 @@
             </w:pPr>
             <w:r>
               <w:rPr/>
-              <w:t xml:space="preserve">Em desenvolvimento</w:t>
+              <w:t xml:space="preserve">Implementado</w:t>
             </w:r>
           </w:p>
         </w:tc>
@@ -2770,7 +2770,7 @@
             </w:pPr>
             <w:r>
               <w:rPr/>
-              <w:t xml:space="preserve">Profissionais autorizados devem registrar dados, observações e histórico do estudante. A ficha reúne turma, condições acompanhadas e necessidades de apoio; data de nascimento, nome social e responsáveis vêm do cadastro do estudante e aparecem na ficha para consulta. Cada gravação preserva a versão anterior, e observações não podem ser editadas nem apagadas. Na web e no aplicativo mobile, o profissional abre a ficha a partir da lista dos estudantes que acompanha, com busca por nome, e registra as consultas realizadas, com data, duração e anotação, que também não podem ser alteradas. A monitoria vê os estudantes que acompanha sem abrir a ficha, e estudante arquivado mantém a ficha apenas para consulta.</w:t>
+              <w:t xml:space="preserve">Profissionais autorizados devem registrar dados, observações e histórico do estudante. Na seção Gestão, na web e no mobile, quem gerencia estudantes cadastra e edita os dados civis e os responsáveis, anexa o termo institucional assinado, em PDF ou imagem de até 2 MB, e arquiva o estudante. A ficha reúne turma, condições acompanhadas e necessidades de apoio; data de nascimento, nome social e responsáveis vêm do cadastro do estudante e aparecem na ficha para consulta. Cada gravação preserva a versão anterior, e observações não podem ser editadas nem apagadas. Na web e no aplicativo mobile, o profissional abre a ficha a partir da lista dos estudantes que acompanha, com busca por nome, e registra as consultas realizadas, com data, duração e anotação, que também não podem ser alteradas. A monitoria vê os estudantes que acompanha sem abrir a ficha, e estudante arquivado mantém a ficha apenas para consulta.</w:t>
             </w:r>
           </w:p>
         </w:tc>
@@ -2971,7 +2971,7 @@
             </w:pPr>
             <w:r>
               <w:rPr/>
-              <w:t xml:space="preserve">Em desenvolvimento</w:t>
+              <w:t xml:space="preserve">Implementado</w:t>
             </w:r>
           </w:p>
         </w:tc>
@@ -4416,7 +4416,7 @@
             </w:pPr>
             <w:r>
               <w:rPr/>
-              <w:t>Em desenvolvimento</w:t>
+              <w:t>Implementado</w:t>
             </w:r>
           </w:p>
         </w:tc>
@@ -8128,7 +8128,7 @@
       </w:pPr>
       <w:r>
         <w:rPr/>
-        <w:t xml:space="preserve">O modelo abaixo representa as entidades atualmente implementadas. Usuários e sessões são globais; vínculos, papéis, permissões, convites, estudantes, responsáveis e atribuições preservam o contexto institucional. Cada vínculo possui um tipo e recebe papéis por membership_roles; os papéis de sistema possuem template_key. Convites guardam somente o hash do token e seus papéis ficam em invitation_roles. Vínculos removidos recebem data e autor da remoção, sem apagar a conta nem a autoria de registros, e vínculos e papéis têm versão para recusar edição feita sobre dados desatualizados. O estudante pode ser cadastrado sem conta própria; seus responsáveis ficam em student_guardians, os consentimentos em student_consents e cada acompanhamento liga um vínculo ativo de profissional ou monitor ao estudante. A ficha do estudante fica em student_profile_revisions, uma revisão por gravação, as observações em student_observations e as consultas realizadas em student_consultations; as três tabelas aceitam somente leitura e inserção, com autoria igual à pessoa autenticada. A grade semanal do aluno fica em routine_blocks, com versão para recusar edição feita sobre dados desatualizados. As tabelas de responsáveis, consentimentos, ficha e rotina ainda não aparecem no diagrama. O banco aplica isolamento por linha para impedir acesso entre instituições.</w:t>
+        <w:t xml:space="preserve">O modelo abaixo representa as entidades atualmente implementadas. Usuários e sessões são globais; vínculos, papéis, permissões, convites, estudantes, responsáveis e atribuições preservam o contexto institucional. Cada vínculo possui um tipo e recebe papéis por membership_roles; os papéis de sistema possuem template_key. Convites guardam somente o hash do token e seus papéis ficam em invitation_roles. Vínculos removidos recebem data e autor da remoção, sem apagar a conta nem a autoria de registros, e vínculos e papéis têm versão para recusar edição feita sobre dados desatualizados. O estudante pode ser cadastrado sem conta própria; seus responsáveis ficam em student_guardians, os consentimentos, com o termo assinado, em student_consents e cada acompanhamento liga um vínculo ativo de profissional ou monitor ao estudante. A ficha do estudante fica em student_profile_revisions, uma revisão por gravação, as observações em student_observations e as consultas realizadas em student_consultations; as três tabelas aceitam somente leitura e inserção, com autoria igual à pessoa autenticada. A grade semanal do aluno fica em routine_blocks, com versão para recusar edição feita sobre dados desatualizados. O banco aplica isolamento por linha para impedir acesso entre instituições.</w:t>
       </w:r>
     </w:p>
     <w:p>
@@ -10475,7 +10475,7 @@
             </w:pPr>
             <w:r>
               <w:rPr/>
-              <w:t>Em desenvolvimento</w:t>
+              <w:t>Implementado</w:t>
             </w:r>
           </w:p>
         </w:tc>
@@ -10497,7 +10497,7 @@
             </w:pPr>
             <w:r>
               <w:rPr/>
-              <w:t>Papéis somados, catálogo fechado, isolamento institucional e gestão da equipe</w:t>
+              <w:t>Papéis somados, catálogo fechado, isolamento institucional, gestão da equipe e acompanhamentos</w:t>
             </w:r>
           </w:p>
         </w:tc>
@@ -10566,7 +10566,7 @@
             </w:pPr>
             <w:r>
               <w:rPr/>
-              <w:t>Em desenvolvimento</w:t>
+              <w:t>Implementado</w:t>
             </w:r>
           </w:p>
         </w:tc>
@@ -10748,7 +10748,7 @@
             </w:pPr>
             <w:r>
               <w:rPr/>
-              <w:t xml:space="preserve">Em desenvolvimento</w:t>
+              <w:t xml:space="preserve">Implementado</w:t>
             </w:r>
           </w:p>
         </w:tc>
@@ -10770,7 +10770,7 @@
             </w:pPr>
             <w:r>
               <w:rPr/>
-              <w:t xml:space="preserve">Dados de apoio, histórico e consultas realizadas; auditoria prevista</w:t>
+              <w:t xml:space="preserve">Cadastro do estudante, termo assinado, ficha, histórico e consultas realizadas; auditoria prevista</w:t>
             </w:r>
           </w:p>
         </w:tc>
@@ -11285,6 +11285,1255 @@
       </w:pPr>
       <w:r>
         <w:rPr/>
+        <w:t xml:space="preserve">Período: 19/08/2026 a 09/09/2026.</w:t>
+      </w:r>
+    </w:p>
+    <w:p>
+      <w:pPr>
+        <w:pStyle w:val="normal1"/>
+        <w:keepNext w:val="false"/>
+        <w:keepLines w:val="false"/>
+        <w:pageBreakBefore w:val="false"/>
+        <w:widowControl/>
+        <w:pBdr/>
+        <w:shd w:val="clear" w:fill="auto"/>
+        <w:spacing w:lineRule="auto" w:line="300" w:before="0" w:after="0"/>
+        <w:ind w:firstLine="720" w:start="0" w:end="0"/>
+        <w:jc w:val="both"/>
+        <w:rPr/>
+      </w:pPr>
+      <w:r>
+        <w:rPr/>
+        <w:t xml:space="preserve">A primeira sprint preparou a base técnica do produto. O objetivo foi deixar o repositório pronto para receber funcionalidades com segurança: aplicações separadas, pacotes compartilhados, regras de desenvolvimento verificadas automaticamente e uma primeira função ponta a ponta, a consulta de estado do serviço, funcionando na API, na web e no mobile.</w:t>
+      </w:r>
+    </w:p>
+    <w:p>
+      <w:pPr>
+        <w:pStyle w:val="normal1"/>
+        <w:keepNext w:val="false"/>
+        <w:keepLines w:val="false"/>
+        <w:pageBreakBefore w:val="false"/>
+        <w:widowControl/>
+        <w:pBdr/>
+        <w:shd w:val="clear" w:fill="auto"/>
+        <w:spacing w:lineRule="auto" w:line="300" w:before="0" w:after="0"/>
+        <w:ind w:firstLine="720" w:start="0" w:end="0"/>
+        <w:jc w:val="both"/>
+        <w:rPr/>
+      </w:pPr>
+      <w:r>
+        <w:rPr/>
+        <w:t xml:space="preserve">Todas as entregas previstas para a sprint foram concluídas; a tabela apresenta a data em que cada uma foi entregue.</w:t>
+      </w:r>
+    </w:p>
+    <w:p>
+      <w:pPr>
+        <w:pStyle w:val="normal1"/>
+        <w:keepNext w:val="false"/>
+        <w:keepLines w:val="false"/>
+        <w:pageBreakBefore w:val="false"/>
+        <w:widowControl/>
+        <w:pBdr/>
+        <w:shd w:val="clear" w:fill="auto"/>
+        <w:spacing w:lineRule="auto" w:line="300" w:before="0" w:after="0"/>
+        <w:ind w:firstLine="720" w:start="0" w:end="0"/>
+        <w:jc w:val="both"/>
+        <w:rPr/>
+      </w:pPr>
+      <w:r>
+        <w:rPr/>
+      </w:r>
+    </w:p>
+    <w:tbl>
+      <w:tblPr>
+        <w:tblStyle w:val="Table2"/>
+        <w:tblW w:w="10203" w:type="dxa"/>
+        <w:jc w:val="start"/>
+        <w:tblInd w:w="-53" w:type="dxa"/>
+        <w:tblLayout w:type="fixed"/>
+        <w:tblCellMar>
+          <w:top w:w="0" w:type="dxa"/>
+          <w:start w:w="108" w:type="dxa"/>
+          <w:bottom w:w="0" w:type="dxa"/>
+          <w:end w:w="108" w:type="dxa"/>
+        </w:tblCellMar>
+        <w:tblLook w:val="0400"/>
+      </w:tblPr>
+      <w:tblGrid>
+        <w:gridCol w:w="2400"/>
+        <w:gridCol w:w="1900"/>
+        <w:gridCol w:w="1400"/>
+        <w:gridCol w:w="4502"/>
+      </w:tblGrid>
+      <w:tr>
+        <w:trPr/>
+        <w:tc>
+          <w:tcPr>
+            <w:tcW w:w="10202" w:type="dxa"/>
+            <w:gridSpan w:val="4"/>
+            <w:tcBorders>
+              <w:top w:val="single" w:sz="4" w:space="0" w:color="000001"/>
+              <w:start w:val="single" w:sz="4" w:space="0" w:color="000001"/>
+              <w:bottom w:val="single" w:sz="4" w:space="0" w:color="000001"/>
+              <w:end w:val="single" w:sz="4" w:space="0" w:color="000001"/>
+            </w:tcBorders>
+            <w:shd w:fill="auto" w:val="clear"/>
+          </w:tcPr>
+          <w:p>
+            <w:pPr>
+              <w:pStyle w:val="normal1"/>
+              <w:rPr/>
+            </w:pPr>
+            <w:r>
+              <w:rPr>
+                <w:b/>
+                <w:bCs/>
+              </w:rPr>
+              <w:t>Entregas da Sprint 1</w:t>
+            </w:r>
+          </w:p>
+        </w:tc>
+      </w:tr>
+      <w:tr>
+        <w:trPr/>
+        <w:tc>
+          <w:tcPr>
+            <w:tcW w:w="2400" w:type="dxa"/>
+            <w:tcBorders>
+              <w:top w:val="single" w:sz="4" w:space="0" w:color="000001"/>
+              <w:start w:val="single" w:sz="4" w:space="0" w:color="000001"/>
+              <w:bottom w:val="single" w:sz="4" w:space="0" w:color="000001"/>
+              <w:end w:val="single" w:sz="4" w:space="0" w:color="000001"/>
+            </w:tcBorders>
+            <w:shd w:fill="auto" w:val="clear"/>
+          </w:tcPr>
+          <w:p>
+            <w:pPr>
+              <w:pStyle w:val="normal1"/>
+              <w:rPr/>
+            </w:pPr>
+            <w:r>
+              <w:rPr>
+                <w:b/>
+                <w:bCs/>
+              </w:rPr>
+              <w:t>Entrega</w:t>
+            </w:r>
+          </w:p>
+        </w:tc>
+        <w:tc>
+          <w:tcPr>
+            <w:tcW w:w="1900" w:type="dxa"/>
+            <w:tcBorders>
+              <w:top w:val="single" w:sz="4" w:space="0" w:color="000001"/>
+              <w:start w:val="single" w:sz="4" w:space="0" w:color="000001"/>
+              <w:bottom w:val="single" w:sz="4" w:space="0" w:color="000001"/>
+              <w:end w:val="single" w:sz="4" w:space="0" w:color="000001"/>
+            </w:tcBorders>
+            <w:shd w:fill="auto" w:val="clear"/>
+          </w:tcPr>
+          <w:p>
+            <w:pPr>
+              <w:pStyle w:val="normal1"/>
+              <w:rPr/>
+            </w:pPr>
+            <w:r>
+              <w:rPr>
+                <w:b/>
+                <w:bCs/>
+              </w:rPr>
+              <w:t>Área</w:t>
+            </w:r>
+          </w:p>
+        </w:tc>
+        <w:tc>
+          <w:tcPr>
+            <w:tcW w:w="1400" w:type="dxa"/>
+            <w:tcBorders>
+              <w:top w:val="single" w:sz="4" w:space="0" w:color="000001"/>
+              <w:start w:val="single" w:sz="4" w:space="0" w:color="000001"/>
+              <w:bottom w:val="single" w:sz="4" w:space="0" w:color="000001"/>
+              <w:end w:val="single" w:sz="4" w:space="0" w:color="000001"/>
+            </w:tcBorders>
+            <w:shd w:fill="auto" w:val="clear"/>
+          </w:tcPr>
+          <w:p>
+            <w:pPr>
+              <w:pStyle w:val="normal1"/>
+              <w:rPr/>
+            </w:pPr>
+            <w:r>
+              <w:rPr>
+                <w:b/>
+                <w:bCs/>
+              </w:rPr>
+              <w:t>Data de entrega</w:t>
+            </w:r>
+          </w:p>
+        </w:tc>
+        <w:tc>
+          <w:tcPr>
+            <w:tcW w:w="4502" w:type="dxa"/>
+            <w:tcBorders>
+              <w:top w:val="single" w:sz="4" w:space="0" w:color="000001"/>
+              <w:start w:val="single" w:sz="4" w:space="0" w:color="000001"/>
+              <w:bottom w:val="single" w:sz="4" w:space="0" w:color="000001"/>
+              <w:end w:val="single" w:sz="4" w:space="0" w:color="000001"/>
+            </w:tcBorders>
+            <w:shd w:fill="auto" w:val="clear"/>
+          </w:tcPr>
+          <w:p>
+            <w:pPr>
+              <w:pStyle w:val="normal1"/>
+              <w:rPr/>
+            </w:pPr>
+            <w:r>
+              <w:rPr>
+                <w:b/>
+                <w:bCs/>
+              </w:rPr>
+              <w:t>Descrição</w:t>
+            </w:r>
+          </w:p>
+        </w:tc>
+      </w:tr>
+      <w:tr>
+        <w:trPr/>
+        <w:tc>
+          <w:tcPr>
+            <w:tcW w:w="2400" w:type="dxa"/>
+            <w:tcBorders>
+              <w:top w:val="single" w:sz="4" w:space="0" w:color="000001"/>
+              <w:start w:val="single" w:sz="4" w:space="0" w:color="000001"/>
+              <w:bottom w:val="single" w:sz="4" w:space="0" w:color="000001"/>
+              <w:end w:val="single" w:sz="4" w:space="0" w:color="000001"/>
+            </w:tcBorders>
+            <w:shd w:fill="auto" w:val="clear"/>
+          </w:tcPr>
+          <w:p>
+            <w:pPr>
+              <w:pStyle w:val="normal1"/>
+              <w:rPr/>
+            </w:pPr>
+            <w:r>
+              <w:rPr/>
+              <w:t>Monorepo e automação</w:t>
+            </w:r>
+          </w:p>
+        </w:tc>
+        <w:tc>
+          <w:tcPr>
+            <w:tcW w:w="1900" w:type="dxa"/>
+            <w:tcBorders>
+              <w:top w:val="single" w:sz="4" w:space="0" w:color="000001"/>
+              <w:start w:val="single" w:sz="4" w:space="0" w:color="000001"/>
+              <w:bottom w:val="single" w:sz="4" w:space="0" w:color="000001"/>
+              <w:end w:val="single" w:sz="4" w:space="0" w:color="000001"/>
+            </w:tcBorders>
+            <w:shd w:fill="auto" w:val="clear"/>
+          </w:tcPr>
+          <w:p>
+            <w:pPr>
+              <w:pStyle w:val="normal1"/>
+              <w:rPr/>
+            </w:pPr>
+            <w:r>
+              <w:rPr/>
+              <w:t>Infraestrutura</w:t>
+            </w:r>
+          </w:p>
+        </w:tc>
+        <w:tc>
+          <w:tcPr>
+            <w:tcW w:w="1400" w:type="dxa"/>
+            <w:tcBorders>
+              <w:top w:val="single" w:sz="4" w:space="0" w:color="000001"/>
+              <w:start w:val="single" w:sz="4" w:space="0" w:color="000001"/>
+              <w:bottom w:val="single" w:sz="4" w:space="0" w:color="000001"/>
+              <w:end w:val="single" w:sz="4" w:space="0" w:color="000001"/>
+            </w:tcBorders>
+            <w:shd w:fill="auto" w:val="clear"/>
+          </w:tcPr>
+          <w:p>
+            <w:pPr>
+              <w:pStyle w:val="normal1"/>
+              <w:rPr/>
+            </w:pPr>
+            <w:r>
+              <w:rPr/>
+              <w:t>22/08/2026</w:t>
+            </w:r>
+          </w:p>
+        </w:tc>
+        <w:tc>
+          <w:tcPr>
+            <w:tcW w:w="4502" w:type="dxa"/>
+            <w:tcBorders>
+              <w:top w:val="single" w:sz="4" w:space="0" w:color="000001"/>
+              <w:start w:val="single" w:sz="4" w:space="0" w:color="000001"/>
+              <w:bottom w:val="single" w:sz="4" w:space="0" w:color="000001"/>
+              <w:end w:val="single" w:sz="4" w:space="0" w:color="000001"/>
+            </w:tcBorders>
+            <w:shd w:fill="auto" w:val="clear"/>
+          </w:tcPr>
+          <w:p>
+            <w:pPr>
+              <w:pStyle w:val="normal1"/>
+              <w:rPr/>
+            </w:pPr>
+            <w:r>
+              <w:rPr/>
+              <w:t>pnpm workspaces, Turborepo, TypeScript 6 e ESM em todos os pacotes; integração contínua executa lint, tipos, testes e build de cada workspace.</w:t>
+            </w:r>
+          </w:p>
+        </w:tc>
+      </w:tr>
+      <w:tr>
+        <w:trPr/>
+        <w:tc>
+          <w:tcPr>
+            <w:tcW w:w="2400" w:type="dxa"/>
+            <w:tcBorders>
+              <w:top w:val="single" w:sz="4" w:space="0" w:color="000001"/>
+              <w:start w:val="single" w:sz="4" w:space="0" w:color="000001"/>
+              <w:bottom w:val="single" w:sz="4" w:space="0" w:color="000001"/>
+              <w:end w:val="single" w:sz="4" w:space="0" w:color="000001"/>
+            </w:tcBorders>
+            <w:shd w:fill="auto" w:val="clear"/>
+          </w:tcPr>
+          <w:p>
+            <w:pPr>
+              <w:pStyle w:val="normal1"/>
+              <w:rPr/>
+            </w:pPr>
+            <w:r>
+              <w:rPr/>
+              <w:t>Regras de desenvolvimento</w:t>
+            </w:r>
+          </w:p>
+        </w:tc>
+        <w:tc>
+          <w:tcPr>
+            <w:tcW w:w="1900" w:type="dxa"/>
+            <w:tcBorders>
+              <w:top w:val="single" w:sz="4" w:space="0" w:color="000001"/>
+              <w:start w:val="single" w:sz="4" w:space="0" w:color="000001"/>
+              <w:bottom w:val="single" w:sz="4" w:space="0" w:color="000001"/>
+              <w:end w:val="single" w:sz="4" w:space="0" w:color="000001"/>
+            </w:tcBorders>
+            <w:shd w:fill="auto" w:val="clear"/>
+          </w:tcPr>
+          <w:p>
+            <w:pPr>
+              <w:pStyle w:val="normal1"/>
+              <w:rPr/>
+            </w:pPr>
+            <w:r>
+              <w:rPr/>
+              <w:t>Infraestrutura</w:t>
+            </w:r>
+          </w:p>
+        </w:tc>
+        <w:tc>
+          <w:tcPr>
+            <w:tcW w:w="1400" w:type="dxa"/>
+            <w:tcBorders>
+              <w:top w:val="single" w:sz="4" w:space="0" w:color="000001"/>
+              <w:start w:val="single" w:sz="4" w:space="0" w:color="000001"/>
+              <w:bottom w:val="single" w:sz="4" w:space="0" w:color="000001"/>
+              <w:end w:val="single" w:sz="4" w:space="0" w:color="000001"/>
+            </w:tcBorders>
+            <w:shd w:fill="auto" w:val="clear"/>
+          </w:tcPr>
+          <w:p>
+            <w:pPr>
+              <w:pStyle w:val="normal1"/>
+              <w:rPr/>
+            </w:pPr>
+            <w:r>
+              <w:rPr/>
+              <w:t>26/08/2026</w:t>
+            </w:r>
+          </w:p>
+        </w:tc>
+        <w:tc>
+          <w:tcPr>
+            <w:tcW w:w="4502" w:type="dxa"/>
+            <w:tcBorders>
+              <w:top w:val="single" w:sz="4" w:space="0" w:color="000001"/>
+              <w:start w:val="single" w:sz="4" w:space="0" w:color="000001"/>
+              <w:bottom w:val="single" w:sz="4" w:space="0" w:color="000001"/>
+              <w:end w:val="single" w:sz="4" w:space="0" w:color="000001"/>
+            </w:tcBorders>
+            <w:shd w:fill="auto" w:val="clear"/>
+          </w:tcPr>
+          <w:p>
+            <w:pPr>
+              <w:pStyle w:val="normal1"/>
+              <w:rPr/>
+            </w:pPr>
+            <w:r>
+              <w:rPr/>
+              <w:t>Regras de arquitetura, idioma, tipos, erros e testes; lint de fronteiras entre pacotes, proibição de any, forwardRef e class-validator, nomes em kebab-case e Conventional Commits.</w:t>
+            </w:r>
+          </w:p>
+        </w:tc>
+      </w:tr>
+      <w:tr>
+        <w:trPr/>
+        <w:tc>
+          <w:tcPr>
+            <w:tcW w:w="2400" w:type="dxa"/>
+            <w:tcBorders>
+              <w:top w:val="single" w:sz="4" w:space="0" w:color="000001"/>
+              <w:start w:val="single" w:sz="4" w:space="0" w:color="000001"/>
+              <w:bottom w:val="single" w:sz="4" w:space="0" w:color="000001"/>
+              <w:end w:val="single" w:sz="4" w:space="0" w:color="000001"/>
+            </w:tcBorders>
+            <w:shd w:fill="auto" w:val="clear"/>
+          </w:tcPr>
+          <w:p>
+            <w:pPr>
+              <w:pStyle w:val="normal1"/>
+              <w:rPr/>
+            </w:pPr>
+            <w:r>
+              <w:rPr/>
+              <w:t>Separação das aplicações</w:t>
+            </w:r>
+          </w:p>
+        </w:tc>
+        <w:tc>
+          <w:tcPr>
+            <w:tcW w:w="1900" w:type="dxa"/>
+            <w:tcBorders>
+              <w:top w:val="single" w:sz="4" w:space="0" w:color="000001"/>
+              <w:start w:val="single" w:sz="4" w:space="0" w:color="000001"/>
+              <w:bottom w:val="single" w:sz="4" w:space="0" w:color="000001"/>
+              <w:end w:val="single" w:sz="4" w:space="0" w:color="000001"/>
+            </w:tcBorders>
+            <w:shd w:fill="auto" w:val="clear"/>
+          </w:tcPr>
+          <w:p>
+            <w:pPr>
+              <w:pStyle w:val="normal1"/>
+              <w:rPr/>
+            </w:pPr>
+            <w:r>
+              <w:rPr/>
+              <w:t>Infraestrutura</w:t>
+            </w:r>
+          </w:p>
+        </w:tc>
+        <w:tc>
+          <w:tcPr>
+            <w:tcW w:w="1400" w:type="dxa"/>
+            <w:tcBorders>
+              <w:top w:val="single" w:sz="4" w:space="0" w:color="000001"/>
+              <w:start w:val="single" w:sz="4" w:space="0" w:color="000001"/>
+              <w:bottom w:val="single" w:sz="4" w:space="0" w:color="000001"/>
+              <w:end w:val="single" w:sz="4" w:space="0" w:color="000001"/>
+            </w:tcBorders>
+            <w:shd w:fill="auto" w:val="clear"/>
+          </w:tcPr>
+          <w:p>
+            <w:pPr>
+              <w:pStyle w:val="normal1"/>
+              <w:rPr/>
+            </w:pPr>
+            <w:r>
+              <w:rPr/>
+              <w:t>27/08/2026</w:t>
+            </w:r>
+          </w:p>
+        </w:tc>
+        <w:tc>
+          <w:tcPr>
+            <w:tcW w:w="4502" w:type="dxa"/>
+            <w:tcBorders>
+              <w:top w:val="single" w:sz="4" w:space="0" w:color="000001"/>
+              <w:start w:val="single" w:sz="4" w:space="0" w:color="000001"/>
+              <w:bottom w:val="single" w:sz="4" w:space="0" w:color="000001"/>
+              <w:end w:val="single" w:sz="4" w:space="0" w:color="000001"/>
+            </w:tcBorders>
+            <w:shd w:fill="auto" w:val="clear"/>
+          </w:tcPr>
+          <w:p>
+            <w:pPr>
+              <w:pStyle w:val="normal1"/>
+              <w:rPr/>
+            </w:pPr>
+            <w:r>
+              <w:rPr/>
+              <w:t>Aplicações api, web e mobile e pacotes core, design-tokens, react-client e config, cada um com entrypoints públicos explícitos.</w:t>
+            </w:r>
+          </w:p>
+        </w:tc>
+      </w:tr>
+      <w:tr>
+        <w:trPr/>
+        <w:tc>
+          <w:tcPr>
+            <w:tcW w:w="2400" w:type="dxa"/>
+            <w:tcBorders>
+              <w:top w:val="single" w:sz="4" w:space="0" w:color="000001"/>
+              <w:start w:val="single" w:sz="4" w:space="0" w:color="000001"/>
+              <w:bottom w:val="single" w:sz="4" w:space="0" w:color="000001"/>
+              <w:end w:val="single" w:sz="4" w:space="0" w:color="000001"/>
+            </w:tcBorders>
+            <w:shd w:fill="auto" w:val="clear"/>
+          </w:tcPr>
+          <w:p>
+            <w:pPr>
+              <w:pStyle w:val="normal1"/>
+              <w:rPr/>
+            </w:pPr>
+            <w:r>
+              <w:rPr/>
+              <w:t>Contrato da API</w:t>
+            </w:r>
+          </w:p>
+        </w:tc>
+        <w:tc>
+          <w:tcPr>
+            <w:tcW w:w="1900" w:type="dxa"/>
+            <w:tcBorders>
+              <w:top w:val="single" w:sz="4" w:space="0" w:color="000001"/>
+              <w:start w:val="single" w:sz="4" w:space="0" w:color="000001"/>
+              <w:bottom w:val="single" w:sz="4" w:space="0" w:color="000001"/>
+              <w:end w:val="single" w:sz="4" w:space="0" w:color="000001"/>
+            </w:tcBorders>
+            <w:shd w:fill="auto" w:val="clear"/>
+          </w:tcPr>
+          <w:p>
+            <w:pPr>
+              <w:pStyle w:val="normal1"/>
+              <w:rPr/>
+            </w:pPr>
+            <w:r>
+              <w:rPr/>
+              <w:t>Pacote compartilhado</w:t>
+            </w:r>
+          </w:p>
+        </w:tc>
+        <w:tc>
+          <w:tcPr>
+            <w:tcW w:w="1400" w:type="dxa"/>
+            <w:tcBorders>
+              <w:top w:val="single" w:sz="4" w:space="0" w:color="000001"/>
+              <w:start w:val="single" w:sz="4" w:space="0" w:color="000001"/>
+              <w:bottom w:val="single" w:sz="4" w:space="0" w:color="000001"/>
+              <w:end w:val="single" w:sz="4" w:space="0" w:color="000001"/>
+            </w:tcBorders>
+            <w:shd w:fill="auto" w:val="clear"/>
+          </w:tcPr>
+          <w:p>
+            <w:pPr>
+              <w:pStyle w:val="normal1"/>
+              <w:rPr/>
+            </w:pPr>
+            <w:r>
+              <w:rPr/>
+              <w:t>28/08/2026</w:t>
+            </w:r>
+          </w:p>
+        </w:tc>
+        <w:tc>
+          <w:tcPr>
+            <w:tcW w:w="4502" w:type="dxa"/>
+            <w:tcBorders>
+              <w:top w:val="single" w:sz="4" w:space="0" w:color="000001"/>
+              <w:start w:val="single" w:sz="4" w:space="0" w:color="000001"/>
+              <w:bottom w:val="single" w:sz="4" w:space="0" w:color="000001"/>
+              <w:end w:val="single" w:sz="4" w:space="0" w:color="000001"/>
+            </w:tcBorders>
+            <w:shd w:fill="auto" w:val="clear"/>
+          </w:tcPr>
+          <w:p>
+            <w:pPr>
+              <w:pStyle w:val="normal1"/>
+              <w:rPr/>
+            </w:pPr>
+            <w:r>
+              <w:rPr/>
+              <w:t>Contrato versionado em /v1 declarado com Zod e oRPC, catálogo fechado de falhas, identificadores tipados e documento OpenAPI gerado.</w:t>
+            </w:r>
+          </w:p>
+        </w:tc>
+      </w:tr>
+      <w:tr>
+        <w:trPr/>
+        <w:tc>
+          <w:tcPr>
+            <w:tcW w:w="2400" w:type="dxa"/>
+            <w:tcBorders>
+              <w:top w:val="single" w:sz="4" w:space="0" w:color="000001"/>
+              <w:start w:val="single" w:sz="4" w:space="0" w:color="000001"/>
+              <w:bottom w:val="single" w:sz="4" w:space="0" w:color="000001"/>
+              <w:end w:val="single" w:sz="4" w:space="0" w:color="000001"/>
+            </w:tcBorders>
+            <w:shd w:fill="auto" w:val="clear"/>
+          </w:tcPr>
+          <w:p>
+            <w:pPr>
+              <w:pStyle w:val="normal1"/>
+              <w:rPr/>
+            </w:pPr>
+            <w:r>
+              <w:rPr/>
+              <w:t>Tokens visuais</w:t>
+            </w:r>
+          </w:p>
+        </w:tc>
+        <w:tc>
+          <w:tcPr>
+            <w:tcW w:w="1900" w:type="dxa"/>
+            <w:tcBorders>
+              <w:top w:val="single" w:sz="4" w:space="0" w:color="000001"/>
+              <w:start w:val="single" w:sz="4" w:space="0" w:color="000001"/>
+              <w:bottom w:val="single" w:sz="4" w:space="0" w:color="000001"/>
+              <w:end w:val="single" w:sz="4" w:space="0" w:color="000001"/>
+            </w:tcBorders>
+            <w:shd w:fill="auto" w:val="clear"/>
+          </w:tcPr>
+          <w:p>
+            <w:pPr>
+              <w:pStyle w:val="normal1"/>
+              <w:rPr/>
+            </w:pPr>
+            <w:r>
+              <w:rPr/>
+              <w:t>Pacote compartilhado</w:t>
+            </w:r>
+          </w:p>
+        </w:tc>
+        <w:tc>
+          <w:tcPr>
+            <w:tcW w:w="1400" w:type="dxa"/>
+            <w:tcBorders>
+              <w:top w:val="single" w:sz="4" w:space="0" w:color="000001"/>
+              <w:start w:val="single" w:sz="4" w:space="0" w:color="000001"/>
+              <w:bottom w:val="single" w:sz="4" w:space="0" w:color="000001"/>
+              <w:end w:val="single" w:sz="4" w:space="0" w:color="000001"/>
+            </w:tcBorders>
+            <w:shd w:fill="auto" w:val="clear"/>
+          </w:tcPr>
+          <w:p>
+            <w:pPr>
+              <w:pStyle w:val="normal1"/>
+              <w:rPr/>
+            </w:pPr>
+            <w:r>
+              <w:rPr/>
+              <w:t>29/08/2026</w:t>
+            </w:r>
+          </w:p>
+        </w:tc>
+        <w:tc>
+          <w:tcPr>
+            <w:tcW w:w="4502" w:type="dxa"/>
+            <w:tcBorders>
+              <w:top w:val="single" w:sz="4" w:space="0" w:color="000001"/>
+              <w:start w:val="single" w:sz="4" w:space="0" w:color="000001"/>
+              <w:bottom w:val="single" w:sz="4" w:space="0" w:color="000001"/>
+              <w:end w:val="single" w:sz="4" w:space="0" w:color="000001"/>
+            </w:tcBorders>
+            <w:shd w:fill="auto" w:val="clear"/>
+          </w:tcPr>
+          <w:p>
+            <w:pPr>
+              <w:pStyle w:val="normal1"/>
+              <w:rPr/>
+            </w:pPr>
+            <w:r>
+              <w:rPr/>
+              <w:t>Escalas de cor, espaçamento e tipografia com verificação automática de contraste WCAG 2.2 AA e variáveis de tema para a web.</w:t>
+            </w:r>
+          </w:p>
+        </w:tc>
+      </w:tr>
+      <w:tr>
+        <w:trPr/>
+        <w:tc>
+          <w:tcPr>
+            <w:tcW w:w="2400" w:type="dxa"/>
+            <w:tcBorders>
+              <w:top w:val="single" w:sz="4" w:space="0" w:color="000001"/>
+              <w:start w:val="single" w:sz="4" w:space="0" w:color="000001"/>
+              <w:bottom w:val="single" w:sz="4" w:space="0" w:color="000001"/>
+              <w:end w:val="single" w:sz="4" w:space="0" w:color="000001"/>
+            </w:tcBorders>
+            <w:shd w:fill="auto" w:val="clear"/>
+          </w:tcPr>
+          <w:p>
+            <w:pPr>
+              <w:pStyle w:val="normal1"/>
+              <w:rPr/>
+            </w:pPr>
+            <w:r>
+              <w:rPr/>
+              <w:t>Banco de dados e isolamento</w:t>
+            </w:r>
+          </w:p>
+        </w:tc>
+        <w:tc>
+          <w:tcPr>
+            <w:tcW w:w="1900" w:type="dxa"/>
+            <w:tcBorders>
+              <w:top w:val="single" w:sz="4" w:space="0" w:color="000001"/>
+              <w:start w:val="single" w:sz="4" w:space="0" w:color="000001"/>
+              <w:bottom w:val="single" w:sz="4" w:space="0" w:color="000001"/>
+              <w:end w:val="single" w:sz="4" w:space="0" w:color="000001"/>
+            </w:tcBorders>
+            <w:shd w:fill="auto" w:val="clear"/>
+          </w:tcPr>
+          <w:p>
+            <w:pPr>
+              <w:pStyle w:val="normal1"/>
+              <w:rPr/>
+            </w:pPr>
+            <w:r>
+              <w:rPr/>
+              <w:t>API</w:t>
+            </w:r>
+          </w:p>
+        </w:tc>
+        <w:tc>
+          <w:tcPr>
+            <w:tcW w:w="1400" w:type="dxa"/>
+            <w:tcBorders>
+              <w:top w:val="single" w:sz="4" w:space="0" w:color="000001"/>
+              <w:start w:val="single" w:sz="4" w:space="0" w:color="000001"/>
+              <w:bottom w:val="single" w:sz="4" w:space="0" w:color="000001"/>
+              <w:end w:val="single" w:sz="4" w:space="0" w:color="000001"/>
+            </w:tcBorders>
+            <w:shd w:fill="auto" w:val="clear"/>
+          </w:tcPr>
+          <w:p>
+            <w:pPr>
+              <w:pStyle w:val="normal1"/>
+              <w:rPr/>
+            </w:pPr>
+            <w:r>
+              <w:rPr/>
+              <w:t>01/09/2026</w:t>
+            </w:r>
+          </w:p>
+        </w:tc>
+        <w:tc>
+          <w:tcPr>
+            <w:tcW w:w="4502" w:type="dxa"/>
+            <w:tcBorders>
+              <w:top w:val="single" w:sz="4" w:space="0" w:color="000001"/>
+              <w:start w:val="single" w:sz="4" w:space="0" w:color="000001"/>
+              <w:bottom w:val="single" w:sz="4" w:space="0" w:color="000001"/>
+              <w:end w:val="single" w:sz="4" w:space="0" w:color="000001"/>
+            </w:tcBorders>
+            <w:shd w:fill="auto" w:val="clear"/>
+          </w:tcPr>
+          <w:p>
+            <w:pPr>
+              <w:pStyle w:val="normal1"/>
+              <w:rPr/>
+            </w:pPr>
+            <w:r>
+              <w:rPr/>
+              <w:t>PostgreSQL 18 em Docker Compose, papel de aplicação sem posse das tabelas, transação com contexto de instituição, ator e sessão e isolamento por linha provado em banco real.</w:t>
+            </w:r>
+          </w:p>
+        </w:tc>
+      </w:tr>
+      <w:tr>
+        <w:trPr/>
+        <w:tc>
+          <w:tcPr>
+            <w:tcW w:w="2400" w:type="dxa"/>
+            <w:tcBorders>
+              <w:top w:val="single" w:sz="4" w:space="0" w:color="000001"/>
+              <w:start w:val="single" w:sz="4" w:space="0" w:color="000001"/>
+              <w:bottom w:val="single" w:sz="4" w:space="0" w:color="000001"/>
+              <w:end w:val="single" w:sz="4" w:space="0" w:color="000001"/>
+            </w:tcBorders>
+            <w:shd w:fill="auto" w:val="clear"/>
+          </w:tcPr>
+          <w:p>
+            <w:pPr>
+              <w:pStyle w:val="normal1"/>
+              <w:rPr/>
+            </w:pPr>
+            <w:r>
+              <w:rPr/>
+              <w:t>Base da API</w:t>
+            </w:r>
+          </w:p>
+        </w:tc>
+        <w:tc>
+          <w:tcPr>
+            <w:tcW w:w="1900" w:type="dxa"/>
+            <w:tcBorders>
+              <w:top w:val="single" w:sz="4" w:space="0" w:color="000001"/>
+              <w:start w:val="single" w:sz="4" w:space="0" w:color="000001"/>
+              <w:bottom w:val="single" w:sz="4" w:space="0" w:color="000001"/>
+              <w:end w:val="single" w:sz="4" w:space="0" w:color="000001"/>
+            </w:tcBorders>
+            <w:shd w:fill="auto" w:val="clear"/>
+          </w:tcPr>
+          <w:p>
+            <w:pPr>
+              <w:pStyle w:val="normal1"/>
+              <w:rPr/>
+            </w:pPr>
+            <w:r>
+              <w:rPr/>
+              <w:t>API</w:t>
+            </w:r>
+          </w:p>
+        </w:tc>
+        <w:tc>
+          <w:tcPr>
+            <w:tcW w:w="1400" w:type="dxa"/>
+            <w:tcBorders>
+              <w:top w:val="single" w:sz="4" w:space="0" w:color="000001"/>
+              <w:start w:val="single" w:sz="4" w:space="0" w:color="000001"/>
+              <w:bottom w:val="single" w:sz="4" w:space="0" w:color="000001"/>
+              <w:end w:val="single" w:sz="4" w:space="0" w:color="000001"/>
+            </w:tcBorders>
+            <w:shd w:fill="auto" w:val="clear"/>
+          </w:tcPr>
+          <w:p>
+            <w:pPr>
+              <w:pStyle w:val="normal1"/>
+              <w:rPr/>
+            </w:pPr>
+            <w:r>
+              <w:rPr/>
+              <w:t>02/09/2026</w:t>
+            </w:r>
+          </w:p>
+        </w:tc>
+        <w:tc>
+          <w:tcPr>
+            <w:tcW w:w="4502" w:type="dxa"/>
+            <w:tcBorders>
+              <w:top w:val="single" w:sz="4" w:space="0" w:color="000001"/>
+              <w:start w:val="single" w:sz="4" w:space="0" w:color="000001"/>
+              <w:bottom w:val="single" w:sz="4" w:space="0" w:color="000001"/>
+              <w:end w:val="single" w:sz="4" w:space="0" w:color="000001"/>
+            </w:tcBorders>
+            <w:shd w:fill="auto" w:val="clear"/>
+          </w:tcPr>
+          <w:p>
+            <w:pPr>
+              <w:pStyle w:val="normal1"/>
+              <w:rPr/>
+            </w:pPr>
+            <w:r>
+              <w:rPr/>
+              <w:t>NestJS 12 com configuração validada na inicialização, rotas negadas por padrão, identificador de correlação, logs estruturados com Pino e rota de saúde.</w:t>
+            </w:r>
+          </w:p>
+        </w:tc>
+      </w:tr>
+      <w:tr>
+        <w:trPr/>
+        <w:tc>
+          <w:tcPr>
+            <w:tcW w:w="2400" w:type="dxa"/>
+            <w:tcBorders>
+              <w:top w:val="single" w:sz="4" w:space="0" w:color="000001"/>
+              <w:start w:val="single" w:sz="4" w:space="0" w:color="000001"/>
+              <w:bottom w:val="single" w:sz="4" w:space="0" w:color="000001"/>
+              <w:end w:val="single" w:sz="4" w:space="0" w:color="000001"/>
+            </w:tcBorders>
+            <w:shd w:fill="auto" w:val="clear"/>
+          </w:tcPr>
+          <w:p>
+            <w:pPr>
+              <w:pStyle w:val="normal1"/>
+              <w:rPr/>
+            </w:pPr>
+            <w:r>
+              <w:rPr/>
+              <w:t>Cliente React compartilhado</w:t>
+            </w:r>
+          </w:p>
+        </w:tc>
+        <w:tc>
+          <w:tcPr>
+            <w:tcW w:w="1900" w:type="dxa"/>
+            <w:tcBorders>
+              <w:top w:val="single" w:sz="4" w:space="0" w:color="000001"/>
+              <w:start w:val="single" w:sz="4" w:space="0" w:color="000001"/>
+              <w:bottom w:val="single" w:sz="4" w:space="0" w:color="000001"/>
+              <w:end w:val="single" w:sz="4" w:space="0" w:color="000001"/>
+            </w:tcBorders>
+            <w:shd w:fill="auto" w:val="clear"/>
+          </w:tcPr>
+          <w:p>
+            <w:pPr>
+              <w:pStyle w:val="normal1"/>
+              <w:rPr/>
+            </w:pPr>
+            <w:r>
+              <w:rPr/>
+              <w:t>Pacote compartilhado</w:t>
+            </w:r>
+          </w:p>
+        </w:tc>
+        <w:tc>
+          <w:tcPr>
+            <w:tcW w:w="1400" w:type="dxa"/>
+            <w:tcBorders>
+              <w:top w:val="single" w:sz="4" w:space="0" w:color="000001"/>
+              <w:start w:val="single" w:sz="4" w:space="0" w:color="000001"/>
+              <w:bottom w:val="single" w:sz="4" w:space="0" w:color="000001"/>
+              <w:end w:val="single" w:sz="4" w:space="0" w:color="000001"/>
+            </w:tcBorders>
+            <w:shd w:fill="auto" w:val="clear"/>
+          </w:tcPr>
+          <w:p>
+            <w:pPr>
+              <w:pStyle w:val="normal1"/>
+              <w:rPr/>
+            </w:pPr>
+            <w:r>
+              <w:rPr/>
+              <w:t>03/09/2026</w:t>
+            </w:r>
+          </w:p>
+        </w:tc>
+        <w:tc>
+          <w:tcPr>
+            <w:tcW w:w="4502" w:type="dxa"/>
+            <w:tcBorders>
+              <w:top w:val="single" w:sz="4" w:space="0" w:color="000001"/>
+              <w:start w:val="single" w:sz="4" w:space="0" w:color="000001"/>
+              <w:bottom w:val="single" w:sz="4" w:space="0" w:color="000001"/>
+              <w:end w:val="single" w:sz="4" w:space="0" w:color="000001"/>
+            </w:tcBorders>
+            <w:shd w:fill="auto" w:val="clear"/>
+          </w:tcPr>
+          <w:p>
+            <w:pPr>
+              <w:pStyle w:val="normal1"/>
+              <w:rPr/>
+            </w:pPr>
+            <w:r>
+              <w:rPr/>
+              <w:t>Cliente tipado com TanStack Query, sem interface, consumido igualmente pela web e pelo mobile.</w:t>
+            </w:r>
+          </w:p>
+        </w:tc>
+      </w:tr>
+      <w:tr>
+        <w:trPr/>
+        <w:tc>
+          <w:tcPr>
+            <w:tcW w:w="2400" w:type="dxa"/>
+            <w:tcBorders>
+              <w:top w:val="single" w:sz="4" w:space="0" w:color="000001"/>
+              <w:start w:val="single" w:sz="4" w:space="0" w:color="000001"/>
+              <w:bottom w:val="single" w:sz="4" w:space="0" w:color="000001"/>
+              <w:end w:val="single" w:sz="4" w:space="0" w:color="000001"/>
+            </w:tcBorders>
+            <w:shd w:fill="auto" w:val="clear"/>
+          </w:tcPr>
+          <w:p>
+            <w:pPr>
+              <w:pStyle w:val="normal1"/>
+              <w:rPr/>
+            </w:pPr>
+            <w:r>
+              <w:rPr/>
+              <w:t>Scaffolding da web</w:t>
+            </w:r>
+          </w:p>
+        </w:tc>
+        <w:tc>
+          <w:tcPr>
+            <w:tcW w:w="1900" w:type="dxa"/>
+            <w:tcBorders>
+              <w:top w:val="single" w:sz="4" w:space="0" w:color="000001"/>
+              <w:start w:val="single" w:sz="4" w:space="0" w:color="000001"/>
+              <w:bottom w:val="single" w:sz="4" w:space="0" w:color="000001"/>
+              <w:end w:val="single" w:sz="4" w:space="0" w:color="000001"/>
+            </w:tcBorders>
+            <w:shd w:fill="auto" w:val="clear"/>
+          </w:tcPr>
+          <w:p>
+            <w:pPr>
+              <w:pStyle w:val="normal1"/>
+              <w:rPr/>
+            </w:pPr>
+            <w:r>
+              <w:rPr/>
+              <w:t>Web</w:t>
+            </w:r>
+          </w:p>
+        </w:tc>
+        <w:tc>
+          <w:tcPr>
+            <w:tcW w:w="1400" w:type="dxa"/>
+            <w:tcBorders>
+              <w:top w:val="single" w:sz="4" w:space="0" w:color="000001"/>
+              <w:start w:val="single" w:sz="4" w:space="0" w:color="000001"/>
+              <w:bottom w:val="single" w:sz="4" w:space="0" w:color="000001"/>
+              <w:end w:val="single" w:sz="4" w:space="0" w:color="000001"/>
+            </w:tcBorders>
+            <w:shd w:fill="auto" w:val="clear"/>
+          </w:tcPr>
+          <w:p>
+            <w:pPr>
+              <w:pStyle w:val="normal1"/>
+              <w:rPr/>
+            </w:pPr>
+            <w:r>
+              <w:rPr/>
+              <w:t>04/09/2026</w:t>
+            </w:r>
+          </w:p>
+        </w:tc>
+        <w:tc>
+          <w:tcPr>
+            <w:tcW w:w="4502" w:type="dxa"/>
+            <w:tcBorders>
+              <w:top w:val="single" w:sz="4" w:space="0" w:color="000001"/>
+              <w:start w:val="single" w:sz="4" w:space="0" w:color="000001"/>
+              <w:bottom w:val="single" w:sz="4" w:space="0" w:color="000001"/>
+              <w:end w:val="single" w:sz="4" w:space="0" w:color="000001"/>
+            </w:tcBorders>
+            <w:shd w:fill="auto" w:val="clear"/>
+          </w:tcPr>
+          <w:p>
+            <w:pPr>
+              <w:pStyle w:val="normal1"/>
+              <w:rPr/>
+            </w:pPr>
+            <w:r>
+              <w:rPr/>
+              <w:t>Vite, React, Tailwind CSS e TanStack Router, textos em pt-BR via i18n tipado e tela de estado do serviço com testes de acessibilidade.</w:t>
+            </w:r>
+          </w:p>
+        </w:tc>
+      </w:tr>
+      <w:tr>
+        <w:trPr/>
+        <w:tc>
+          <w:tcPr>
+            <w:tcW w:w="2400" w:type="dxa"/>
+            <w:tcBorders>
+              <w:top w:val="single" w:sz="4" w:space="0" w:color="000001"/>
+              <w:start w:val="single" w:sz="4" w:space="0" w:color="000001"/>
+              <w:bottom w:val="single" w:sz="4" w:space="0" w:color="000001"/>
+              <w:end w:val="single" w:sz="4" w:space="0" w:color="000001"/>
+            </w:tcBorders>
+            <w:shd w:fill="auto" w:val="clear"/>
+          </w:tcPr>
+          <w:p>
+            <w:pPr>
+              <w:pStyle w:val="normal1"/>
+              <w:rPr/>
+            </w:pPr>
+            <w:r>
+              <w:rPr/>
+              <w:t>Scaffolding do mobile</w:t>
+            </w:r>
+          </w:p>
+        </w:tc>
+        <w:tc>
+          <w:tcPr>
+            <w:tcW w:w="1900" w:type="dxa"/>
+            <w:tcBorders>
+              <w:top w:val="single" w:sz="4" w:space="0" w:color="000001"/>
+              <w:start w:val="single" w:sz="4" w:space="0" w:color="000001"/>
+              <w:bottom w:val="single" w:sz="4" w:space="0" w:color="000001"/>
+              <w:end w:val="single" w:sz="4" w:space="0" w:color="000001"/>
+            </w:tcBorders>
+            <w:shd w:fill="auto" w:val="clear"/>
+          </w:tcPr>
+          <w:p>
+            <w:pPr>
+              <w:pStyle w:val="normal1"/>
+              <w:rPr/>
+            </w:pPr>
+            <w:r>
+              <w:rPr/>
+              <w:t>Mobile</w:t>
+            </w:r>
+          </w:p>
+        </w:tc>
+        <w:tc>
+          <w:tcPr>
+            <w:tcW w:w="1400" w:type="dxa"/>
+            <w:tcBorders>
+              <w:top w:val="single" w:sz="4" w:space="0" w:color="000001"/>
+              <w:start w:val="single" w:sz="4" w:space="0" w:color="000001"/>
+              <w:bottom w:val="single" w:sz="4" w:space="0" w:color="000001"/>
+              <w:end w:val="single" w:sz="4" w:space="0" w:color="000001"/>
+            </w:tcBorders>
+            <w:shd w:fill="auto" w:val="clear"/>
+          </w:tcPr>
+          <w:p>
+            <w:pPr>
+              <w:pStyle w:val="normal1"/>
+              <w:rPr/>
+            </w:pPr>
+            <w:r>
+              <w:rPr/>
+              <w:t>05/09/2026</w:t>
+            </w:r>
+          </w:p>
+        </w:tc>
+        <w:tc>
+          <w:tcPr>
+            <w:tcW w:w="4502" w:type="dxa"/>
+            <w:tcBorders>
+              <w:top w:val="single" w:sz="4" w:space="0" w:color="000001"/>
+              <w:start w:val="single" w:sz="4" w:space="0" w:color="000001"/>
+              <w:bottom w:val="single" w:sz="4" w:space="0" w:color="000001"/>
+              <w:end w:val="single" w:sz="4" w:space="0" w:color="000001"/>
+            </w:tcBorders>
+            <w:shd w:fill="auto" w:val="clear"/>
+          </w:tcPr>
+          <w:p>
+            <w:pPr>
+              <w:pStyle w:val="normal1"/>
+              <w:rPr/>
+            </w:pPr>
+            <w:r>
+              <w:rPr/>
+              <w:t>Expo e Expo Router, tokens, i18n tipado, tela de estado do serviço com testes de acessibilidade e perfis de build.</w:t>
+            </w:r>
+          </w:p>
+        </w:tc>
+      </w:tr>
+      <w:tr>
+        <w:trPr/>
+        <w:tc>
+          <w:tcPr>
+            <w:tcW w:w="2400" w:type="dxa"/>
+            <w:tcBorders>
+              <w:top w:val="single" w:sz="4" w:space="0" w:color="000001"/>
+              <w:start w:val="single" w:sz="4" w:space="0" w:color="000001"/>
+              <w:bottom w:val="single" w:sz="4" w:space="0" w:color="000001"/>
+              <w:end w:val="single" w:sz="4" w:space="0" w:color="000001"/>
+            </w:tcBorders>
+            <w:shd w:fill="auto" w:val="clear"/>
+          </w:tcPr>
+          <w:p>
+            <w:pPr>
+              <w:pStyle w:val="normal1"/>
+              <w:rPr/>
+            </w:pPr>
+            <w:r>
+              <w:rPr/>
+              <w:t>Autenticação e permissões</w:t>
+            </w:r>
+          </w:p>
+        </w:tc>
+        <w:tc>
+          <w:tcPr>
+            <w:tcW w:w="1900" w:type="dxa"/>
+            <w:tcBorders>
+              <w:top w:val="single" w:sz="4" w:space="0" w:color="000001"/>
+              <w:start w:val="single" w:sz="4" w:space="0" w:color="000001"/>
+              <w:bottom w:val="single" w:sz="4" w:space="0" w:color="000001"/>
+              <w:end w:val="single" w:sz="4" w:space="0" w:color="000001"/>
+            </w:tcBorders>
+            <w:shd w:fill="auto" w:val="clear"/>
+          </w:tcPr>
+          <w:p>
+            <w:pPr>
+              <w:pStyle w:val="normal1"/>
+              <w:rPr/>
+            </w:pPr>
+            <w:r>
+              <w:rPr/>
+              <w:t>API e pacote compartilhado</w:t>
+            </w:r>
+          </w:p>
+        </w:tc>
+        <w:tc>
+          <w:tcPr>
+            <w:tcW w:w="1400" w:type="dxa"/>
+            <w:tcBorders>
+              <w:top w:val="single" w:sz="4" w:space="0" w:color="000001"/>
+              <w:start w:val="single" w:sz="4" w:space="0" w:color="000001"/>
+              <w:bottom w:val="single" w:sz="4" w:space="0" w:color="000001"/>
+              <w:end w:val="single" w:sz="4" w:space="0" w:color="000001"/>
+            </w:tcBorders>
+            <w:shd w:fill="auto" w:val="clear"/>
+          </w:tcPr>
+          <w:p>
+            <w:pPr>
+              <w:pStyle w:val="normal1"/>
+              <w:rPr/>
+            </w:pPr>
+            <w:r>
+              <w:rPr/>
+              <w:t>09/09/2026</w:t>
+            </w:r>
+          </w:p>
+        </w:tc>
+        <w:tc>
+          <w:tcPr>
+            <w:tcW w:w="4502" w:type="dxa"/>
+            <w:tcBorders>
+              <w:top w:val="single" w:sz="4" w:space="0" w:color="000001"/>
+              <w:start w:val="single" w:sz="4" w:space="0" w:color="000001"/>
+              <w:bottom w:val="single" w:sz="4" w:space="0" w:color="000001"/>
+              <w:end w:val="single" w:sz="4" w:space="0" w:color="000001"/>
+            </w:tcBorders>
+            <w:shd w:fill="auto" w:val="clear"/>
+          </w:tcPr>
+          <w:p>
+            <w:pPr>
+              <w:pStyle w:val="normal1"/>
+              <w:rPr/>
+            </w:pPr>
+            <w:r>
+              <w:rPr/>
+              <w:t>Cadastro e entrada pela API, cookie seguro para web e credencial Bearer para mobile, sessões opacas guardadas como hash, encerramento de sessão e catálogo fechado de permissões aplicado a toda rota.</w:t>
+            </w:r>
+          </w:p>
+        </w:tc>
+      </w:tr>
+    </w:tbl>
+    <w:p>
+      <w:pPr>
+        <w:pStyle w:val="normal1"/>
+        <w:keepNext w:val="false"/>
+        <w:keepLines w:val="false"/>
+        <w:pageBreakBefore w:val="false"/>
+        <w:widowControl/>
+        <w:pBdr/>
+        <w:shd w:val="clear" w:fill="auto"/>
+        <w:spacing w:lineRule="auto" w:line="300" w:before="0" w:after="0"/>
+        <w:ind w:firstLine="720" w:start="0" w:end="0"/>
+        <w:jc w:val="both"/>
+        <w:rPr/>
+      </w:pPr>
+      <w:r>
+        <w:rPr/>
+      </w:r>
+    </w:p>
+    <w:p>
+      <w:pPr>
+        <w:pStyle w:val="normal1"/>
+        <w:keepNext w:val="false"/>
+        <w:keepLines w:val="false"/>
+        <w:pageBreakBefore w:val="false"/>
+        <w:widowControl/>
+        <w:pBdr/>
+        <w:shd w:val="clear" w:fill="auto"/>
+        <w:spacing w:lineRule="auto" w:line="300" w:before="0" w:after="0"/>
+        <w:ind w:firstLine="720" w:start="0" w:end="0"/>
+        <w:jc w:val="both"/>
+        <w:rPr/>
+      </w:pPr>
+      <w:r>
+        <w:rPr/>
+        <w:t xml:space="preserve">Resultado: RF0001 foi entregue, a autenticação e as permissões ficaram disponíveis na API para as telas da sprint seguinte, e os requisitos RNF0003, RNF0004, RNF0005, RNF0006, RNF0008 e RNF0009 passaram a ser verificados automaticamente desde a base do projeto. As regras definidas nesta sprint valem para todo o código das sprints seguintes.</w:t>
       </w:r>
       <w:r>
         <w:br w:type="page"/>
@@ -11332,6 +12581,1073 @@
       </w:pPr>
       <w:r>
         <w:rPr/>
+        <w:t xml:space="preserve">Período: 16/09/2026 a 30/09/2026.</w:t>
+      </w:r>
+    </w:p>
+    <w:p>
+      <w:pPr>
+        <w:pStyle w:val="normal1"/>
+        <w:keepNext w:val="false"/>
+        <w:keepLines w:val="false"/>
+        <w:pageBreakBefore w:val="false"/>
+        <w:widowControl/>
+        <w:pBdr/>
+        <w:shd w:val="clear" w:fill="auto"/>
+        <w:spacing w:lineRule="auto" w:line="300" w:before="0" w:after="0"/>
+        <w:ind w:firstLine="720" w:start="0" w:end="0"/>
+        <w:jc w:val="both"/>
+        <w:rPr/>
+      </w:pPr>
+      <w:r>
+        <w:rPr/>
+        <w:t xml:space="preserve">A segunda sprint transformou a base em produto utilizável pelas instituições. Foram entregues o acesso das pessoas, a estrutura de instituições, papéis e equipe e o primeiro conjunto de funções de acompanhamento dos estudantes, sempre na web e no mobile sobre o mesmo contrato.</w:t>
+      </w:r>
+    </w:p>
+    <w:p>
+      <w:pPr>
+        <w:pStyle w:val="normal1"/>
+        <w:keepNext w:val="false"/>
+        <w:keepLines w:val="false"/>
+        <w:pageBreakBefore w:val="false"/>
+        <w:widowControl/>
+        <w:pBdr/>
+        <w:shd w:val="clear" w:fill="auto"/>
+        <w:spacing w:lineRule="auto" w:line="300" w:before="0" w:after="0"/>
+        <w:ind w:firstLine="720" w:start="0" w:end="0"/>
+        <w:jc w:val="both"/>
+        <w:rPr/>
+      </w:pPr>
+      <w:r>
+        <w:rPr/>
+        <w:t xml:space="preserve">Todas as entregas previstas para a sprint foram concluídas; a tabela apresenta a data em que cada uma foi entregue.</w:t>
+      </w:r>
+    </w:p>
+    <w:p>
+      <w:pPr>
+        <w:pStyle w:val="normal1"/>
+        <w:keepNext w:val="false"/>
+        <w:keepLines w:val="false"/>
+        <w:pageBreakBefore w:val="false"/>
+        <w:widowControl/>
+        <w:pBdr/>
+        <w:shd w:val="clear" w:fill="auto"/>
+        <w:spacing w:lineRule="auto" w:line="300" w:before="0" w:after="0"/>
+        <w:ind w:firstLine="720" w:start="0" w:end="0"/>
+        <w:jc w:val="both"/>
+        <w:rPr/>
+      </w:pPr>
+      <w:r>
+        <w:rPr/>
+      </w:r>
+    </w:p>
+    <w:tbl>
+      <w:tblPr>
+        <w:tblStyle w:val="Table2"/>
+        <w:tblW w:w="10203" w:type="dxa"/>
+        <w:jc w:val="start"/>
+        <w:tblInd w:w="-53" w:type="dxa"/>
+        <w:tblLayout w:type="fixed"/>
+        <w:tblCellMar>
+          <w:top w:w="0" w:type="dxa"/>
+          <w:start w:w="108" w:type="dxa"/>
+          <w:bottom w:w="0" w:type="dxa"/>
+          <w:end w:w="108" w:type="dxa"/>
+        </w:tblCellMar>
+        <w:tblLook w:val="0400"/>
+      </w:tblPr>
+      <w:tblGrid>
+        <w:gridCol w:w="2400"/>
+        <w:gridCol w:w="1900"/>
+        <w:gridCol w:w="1400"/>
+        <w:gridCol w:w="4502"/>
+      </w:tblGrid>
+      <w:tr>
+        <w:trPr/>
+        <w:tc>
+          <w:tcPr>
+            <w:tcW w:w="10202" w:type="dxa"/>
+            <w:gridSpan w:val="4"/>
+            <w:tcBorders>
+              <w:top w:val="single" w:sz="4" w:space="0" w:color="000001"/>
+              <w:start w:val="single" w:sz="4" w:space="0" w:color="000001"/>
+              <w:bottom w:val="single" w:sz="4" w:space="0" w:color="000001"/>
+              <w:end w:val="single" w:sz="4" w:space="0" w:color="000001"/>
+            </w:tcBorders>
+            <w:shd w:fill="auto" w:val="clear"/>
+          </w:tcPr>
+          <w:p>
+            <w:pPr>
+              <w:pStyle w:val="normal1"/>
+              <w:rPr/>
+            </w:pPr>
+            <w:r>
+              <w:rPr>
+                <w:b/>
+                <w:bCs/>
+              </w:rPr>
+              <w:t>Entregas da Sprint 2</w:t>
+            </w:r>
+          </w:p>
+        </w:tc>
+      </w:tr>
+      <w:tr>
+        <w:trPr/>
+        <w:tc>
+          <w:tcPr>
+            <w:tcW w:w="2400" w:type="dxa"/>
+            <w:tcBorders>
+              <w:top w:val="single" w:sz="4" w:space="0" w:color="000001"/>
+              <w:start w:val="single" w:sz="4" w:space="0" w:color="000001"/>
+              <w:bottom w:val="single" w:sz="4" w:space="0" w:color="000001"/>
+              <w:end w:val="single" w:sz="4" w:space="0" w:color="000001"/>
+            </w:tcBorders>
+            <w:shd w:fill="auto" w:val="clear"/>
+          </w:tcPr>
+          <w:p>
+            <w:pPr>
+              <w:pStyle w:val="normal1"/>
+              <w:rPr/>
+            </w:pPr>
+            <w:r>
+              <w:rPr>
+                <w:b/>
+                <w:bCs/>
+              </w:rPr>
+              <w:t>Entrega</w:t>
+            </w:r>
+          </w:p>
+        </w:tc>
+        <w:tc>
+          <w:tcPr>
+            <w:tcW w:w="1900" w:type="dxa"/>
+            <w:tcBorders>
+              <w:top w:val="single" w:sz="4" w:space="0" w:color="000001"/>
+              <w:start w:val="single" w:sz="4" w:space="0" w:color="000001"/>
+              <w:bottom w:val="single" w:sz="4" w:space="0" w:color="000001"/>
+              <w:end w:val="single" w:sz="4" w:space="0" w:color="000001"/>
+            </w:tcBorders>
+            <w:shd w:fill="auto" w:val="clear"/>
+          </w:tcPr>
+          <w:p>
+            <w:pPr>
+              <w:pStyle w:val="normal1"/>
+              <w:rPr/>
+            </w:pPr>
+            <w:r>
+              <w:rPr>
+                <w:b/>
+                <w:bCs/>
+              </w:rPr>
+              <w:t>Área</w:t>
+            </w:r>
+          </w:p>
+        </w:tc>
+        <w:tc>
+          <w:tcPr>
+            <w:tcW w:w="1400" w:type="dxa"/>
+            <w:tcBorders>
+              <w:top w:val="single" w:sz="4" w:space="0" w:color="000001"/>
+              <w:start w:val="single" w:sz="4" w:space="0" w:color="000001"/>
+              <w:bottom w:val="single" w:sz="4" w:space="0" w:color="000001"/>
+              <w:end w:val="single" w:sz="4" w:space="0" w:color="000001"/>
+            </w:tcBorders>
+            <w:shd w:fill="auto" w:val="clear"/>
+          </w:tcPr>
+          <w:p>
+            <w:pPr>
+              <w:pStyle w:val="normal1"/>
+              <w:rPr/>
+            </w:pPr>
+            <w:r>
+              <w:rPr>
+                <w:b/>
+                <w:bCs/>
+              </w:rPr>
+              <w:t>Data de entrega</w:t>
+            </w:r>
+          </w:p>
+        </w:tc>
+        <w:tc>
+          <w:tcPr>
+            <w:tcW w:w="4502" w:type="dxa"/>
+            <w:tcBorders>
+              <w:top w:val="single" w:sz="4" w:space="0" w:color="000001"/>
+              <w:start w:val="single" w:sz="4" w:space="0" w:color="000001"/>
+              <w:bottom w:val="single" w:sz="4" w:space="0" w:color="000001"/>
+              <w:end w:val="single" w:sz="4" w:space="0" w:color="000001"/>
+            </w:tcBorders>
+            <w:shd w:fill="auto" w:val="clear"/>
+          </w:tcPr>
+          <w:p>
+            <w:pPr>
+              <w:pStyle w:val="normal1"/>
+              <w:rPr/>
+            </w:pPr>
+            <w:r>
+              <w:rPr>
+                <w:b/>
+                <w:bCs/>
+              </w:rPr>
+              <w:t>Descrição</w:t>
+            </w:r>
+          </w:p>
+        </w:tc>
+      </w:tr>
+      <w:tr>
+        <w:trPr/>
+        <w:tc>
+          <w:tcPr>
+            <w:tcW w:w="2400" w:type="dxa"/>
+            <w:tcBorders>
+              <w:top w:val="single" w:sz="4" w:space="0" w:color="000001"/>
+              <w:start w:val="single" w:sz="4" w:space="0" w:color="000001"/>
+              <w:bottom w:val="single" w:sz="4" w:space="0" w:color="000001"/>
+              <w:end w:val="single" w:sz="4" w:space="0" w:color="000001"/>
+            </w:tcBorders>
+            <w:shd w:fill="auto" w:val="clear"/>
+          </w:tcPr>
+          <w:p>
+            <w:pPr>
+              <w:pStyle w:val="normal1"/>
+              <w:rPr/>
+            </w:pPr>
+            <w:r>
+              <w:rPr/>
+              <w:t>Telas de autenticação</w:t>
+            </w:r>
+          </w:p>
+        </w:tc>
+        <w:tc>
+          <w:tcPr>
+            <w:tcW w:w="1900" w:type="dxa"/>
+            <w:tcBorders>
+              <w:top w:val="single" w:sz="4" w:space="0" w:color="000001"/>
+              <w:start w:val="single" w:sz="4" w:space="0" w:color="000001"/>
+              <w:bottom w:val="single" w:sz="4" w:space="0" w:color="000001"/>
+              <w:end w:val="single" w:sz="4" w:space="0" w:color="000001"/>
+            </w:tcBorders>
+            <w:shd w:fill="auto" w:val="clear"/>
+          </w:tcPr>
+          <w:p>
+            <w:pPr>
+              <w:pStyle w:val="normal1"/>
+              <w:rPr/>
+            </w:pPr>
+            <w:r>
+              <w:rPr/>
+              <w:t>Web e mobile</w:t>
+            </w:r>
+          </w:p>
+        </w:tc>
+        <w:tc>
+          <w:tcPr>
+            <w:tcW w:w="1400" w:type="dxa"/>
+            <w:tcBorders>
+              <w:top w:val="single" w:sz="4" w:space="0" w:color="000001"/>
+              <w:start w:val="single" w:sz="4" w:space="0" w:color="000001"/>
+              <w:bottom w:val="single" w:sz="4" w:space="0" w:color="000001"/>
+              <w:end w:val="single" w:sz="4" w:space="0" w:color="000001"/>
+            </w:tcBorders>
+            <w:shd w:fill="auto" w:val="clear"/>
+          </w:tcPr>
+          <w:p>
+            <w:pPr>
+              <w:pStyle w:val="normal1"/>
+              <w:rPr/>
+            </w:pPr>
+            <w:r>
+              <w:rPr/>
+              <w:t>18/09/2026</w:t>
+            </w:r>
+          </w:p>
+        </w:tc>
+        <w:tc>
+          <w:tcPr>
+            <w:tcW w:w="4502" w:type="dxa"/>
+            <w:tcBorders>
+              <w:top w:val="single" w:sz="4" w:space="0" w:color="000001"/>
+              <w:start w:val="single" w:sz="4" w:space="0" w:color="000001"/>
+              <w:bottom w:val="single" w:sz="4" w:space="0" w:color="000001"/>
+              <w:end w:val="single" w:sz="4" w:space="0" w:color="000001"/>
+            </w:tcBorders>
+            <w:shd w:fill="auto" w:val="clear"/>
+          </w:tcPr>
+          <w:p>
+            <w:pPr>
+              <w:pStyle w:val="normal1"/>
+              <w:rPr/>
+            </w:pPr>
+            <w:r>
+              <w:rPr/>
+              <w:t>Telas de entrada, cadastro e saída sobre a API da sprint anterior, com mensagens de falha junto do campo e credencial guardada com proteção nativa no mobile (RF0002, RF0003 e RF0005).</w:t>
+            </w:r>
+          </w:p>
+        </w:tc>
+      </w:tr>
+      <w:tr>
+        <w:trPr/>
+        <w:tc>
+          <w:tcPr>
+            <w:tcW w:w="2400" w:type="dxa"/>
+            <w:tcBorders>
+              <w:top w:val="single" w:sz="4" w:space="0" w:color="000001"/>
+              <w:start w:val="single" w:sz="4" w:space="0" w:color="000001"/>
+              <w:bottom w:val="single" w:sz="4" w:space="0" w:color="000001"/>
+              <w:end w:val="single" w:sz="4" w:space="0" w:color="000001"/>
+            </w:tcBorders>
+            <w:shd w:fill="auto" w:val="clear"/>
+          </w:tcPr>
+          <w:p>
+            <w:pPr>
+              <w:pStyle w:val="normal1"/>
+              <w:rPr/>
+            </w:pPr>
+            <w:r>
+              <w:rPr/>
+              <w:t>Contexto e ambientes por perfil</w:t>
+            </w:r>
+          </w:p>
+        </w:tc>
+        <w:tc>
+          <w:tcPr>
+            <w:tcW w:w="1900" w:type="dxa"/>
+            <w:tcBorders>
+              <w:top w:val="single" w:sz="4" w:space="0" w:color="000001"/>
+              <w:start w:val="single" w:sz="4" w:space="0" w:color="000001"/>
+              <w:bottom w:val="single" w:sz="4" w:space="0" w:color="000001"/>
+              <w:end w:val="single" w:sz="4" w:space="0" w:color="000001"/>
+            </w:tcBorders>
+            <w:shd w:fill="auto" w:val="clear"/>
+          </w:tcPr>
+          <w:p>
+            <w:pPr>
+              <w:pStyle w:val="normal1"/>
+              <w:rPr/>
+            </w:pPr>
+            <w:r>
+              <w:rPr/>
+              <w:t>Web e mobile</w:t>
+            </w:r>
+          </w:p>
+        </w:tc>
+        <w:tc>
+          <w:tcPr>
+            <w:tcW w:w="1400" w:type="dxa"/>
+            <w:tcBorders>
+              <w:top w:val="single" w:sz="4" w:space="0" w:color="000001"/>
+              <w:start w:val="single" w:sz="4" w:space="0" w:color="000001"/>
+              <w:bottom w:val="single" w:sz="4" w:space="0" w:color="000001"/>
+              <w:end w:val="single" w:sz="4" w:space="0" w:color="000001"/>
+            </w:tcBorders>
+            <w:shd w:fill="auto" w:val="clear"/>
+          </w:tcPr>
+          <w:p>
+            <w:pPr>
+              <w:pStyle w:val="normal1"/>
+              <w:rPr/>
+            </w:pPr>
+            <w:r>
+              <w:rPr/>
+              <w:t>22/09/2026</w:t>
+            </w:r>
+          </w:p>
+        </w:tc>
+        <w:tc>
+          <w:tcPr>
+            <w:tcW w:w="4502" w:type="dxa"/>
+            <w:tcBorders>
+              <w:top w:val="single" w:sz="4" w:space="0" w:color="000001"/>
+              <w:start w:val="single" w:sz="4" w:space="0" w:color="000001"/>
+              <w:bottom w:val="single" w:sz="4" w:space="0" w:color="000001"/>
+              <w:end w:val="single" w:sz="4" w:space="0" w:color="000001"/>
+            </w:tcBorders>
+            <w:shd w:fill="auto" w:val="clear"/>
+          </w:tcPr>
+          <w:p>
+            <w:pPr>
+              <w:pStyle w:val="normal1"/>
+              <w:rPr/>
+            </w:pPr>
+            <w:r>
+              <w:rPr/>
+              <w:t>Resolução de instituições, papéis e permissões após a entrada, troca de instituição, espera por convite e ambiente profissional com navegação definida pelas permissões (RF0004 e RF0006).</w:t>
+            </w:r>
+          </w:p>
+        </w:tc>
+      </w:tr>
+      <w:tr>
+        <w:trPr/>
+        <w:tc>
+          <w:tcPr>
+            <w:tcW w:w="2400" w:type="dxa"/>
+            <w:tcBorders>
+              <w:top w:val="single" w:sz="4" w:space="0" w:color="000001"/>
+              <w:start w:val="single" w:sz="4" w:space="0" w:color="000001"/>
+              <w:bottom w:val="single" w:sz="4" w:space="0" w:color="000001"/>
+              <w:end w:val="single" w:sz="4" w:space="0" w:color="000001"/>
+            </w:tcBorders>
+            <w:shd w:fill="auto" w:val="clear"/>
+          </w:tcPr>
+          <w:p>
+            <w:pPr>
+              <w:pStyle w:val="normal1"/>
+              <w:rPr/>
+            </w:pPr>
+            <w:r>
+              <w:rPr/>
+              <w:t>Instituições e convites</w:t>
+            </w:r>
+          </w:p>
+        </w:tc>
+        <w:tc>
+          <w:tcPr>
+            <w:tcW w:w="1900" w:type="dxa"/>
+            <w:tcBorders>
+              <w:top w:val="single" w:sz="4" w:space="0" w:color="000001"/>
+              <w:start w:val="single" w:sz="4" w:space="0" w:color="000001"/>
+              <w:bottom w:val="single" w:sz="4" w:space="0" w:color="000001"/>
+              <w:end w:val="single" w:sz="4" w:space="0" w:color="000001"/>
+            </w:tcBorders>
+            <w:shd w:fill="auto" w:val="clear"/>
+          </w:tcPr>
+          <w:p>
+            <w:pPr>
+              <w:pStyle w:val="normal1"/>
+              <w:rPr/>
+            </w:pPr>
+            <w:r>
+              <w:rPr/>
+              <w:t>API e web</w:t>
+            </w:r>
+          </w:p>
+        </w:tc>
+        <w:tc>
+          <w:tcPr>
+            <w:tcW w:w="1400" w:type="dxa"/>
+            <w:tcBorders>
+              <w:top w:val="single" w:sz="4" w:space="0" w:color="000001"/>
+              <w:start w:val="single" w:sz="4" w:space="0" w:color="000001"/>
+              <w:bottom w:val="single" w:sz="4" w:space="0" w:color="000001"/>
+              <w:end w:val="single" w:sz="4" w:space="0" w:color="000001"/>
+            </w:tcBorders>
+            <w:shd w:fill="auto" w:val="clear"/>
+          </w:tcPr>
+          <w:p>
+            <w:pPr>
+              <w:pStyle w:val="normal1"/>
+              <w:rPr/>
+            </w:pPr>
+            <w:r>
+              <w:rPr/>
+              <w:t>24/09/2026</w:t>
+            </w:r>
+          </w:p>
+        </w:tc>
+        <w:tc>
+          <w:tcPr>
+            <w:tcW w:w="4502" w:type="dxa"/>
+            <w:tcBorders>
+              <w:top w:val="single" w:sz="4" w:space="0" w:color="000001"/>
+              <w:start w:val="single" w:sz="4" w:space="0" w:color="000001"/>
+              <w:bottom w:val="single" w:sz="4" w:space="0" w:color="000001"/>
+              <w:end w:val="single" w:sz="4" w:space="0" w:color="000001"/>
+            </w:tcBorders>
+            <w:shd w:fill="auto" w:val="clear"/>
+          </w:tcPr>
+          <w:p>
+            <w:pPr>
+              <w:pStyle w:val="normal1"/>
+              <w:rPr/>
+            </w:pPr>
+            <w:r>
+              <w:rPr/>
+              <w:t>O administrador geral cadastra instituições, consulta membros e papéis e convida pessoas por link de uso único válido por sete dias (RF0014).</w:t>
+            </w:r>
+          </w:p>
+        </w:tc>
+      </w:tr>
+      <w:tr>
+        <w:trPr/>
+        <w:tc>
+          <w:tcPr>
+            <w:tcW w:w="2400" w:type="dxa"/>
+            <w:tcBorders>
+              <w:top w:val="single" w:sz="4" w:space="0" w:color="000001"/>
+              <w:start w:val="single" w:sz="4" w:space="0" w:color="000001"/>
+              <w:bottom w:val="single" w:sz="4" w:space="0" w:color="000001"/>
+              <w:end w:val="single" w:sz="4" w:space="0" w:color="000001"/>
+            </w:tcBorders>
+            <w:shd w:fill="auto" w:val="clear"/>
+          </w:tcPr>
+          <w:p>
+            <w:pPr>
+              <w:pStyle w:val="normal1"/>
+              <w:rPr/>
+            </w:pPr>
+            <w:r>
+              <w:rPr/>
+              <w:t>Papéis e permissões</w:t>
+            </w:r>
+          </w:p>
+        </w:tc>
+        <w:tc>
+          <w:tcPr>
+            <w:tcW w:w="1900" w:type="dxa"/>
+            <w:tcBorders>
+              <w:top w:val="single" w:sz="4" w:space="0" w:color="000001"/>
+              <w:start w:val="single" w:sz="4" w:space="0" w:color="000001"/>
+              <w:bottom w:val="single" w:sz="4" w:space="0" w:color="000001"/>
+              <w:end w:val="single" w:sz="4" w:space="0" w:color="000001"/>
+            </w:tcBorders>
+            <w:shd w:fill="auto" w:val="clear"/>
+          </w:tcPr>
+          <w:p>
+            <w:pPr>
+              <w:pStyle w:val="normal1"/>
+              <w:rPr/>
+            </w:pPr>
+            <w:r>
+              <w:rPr/>
+              <w:t>API e pacote compartilhado</w:t>
+            </w:r>
+          </w:p>
+        </w:tc>
+        <w:tc>
+          <w:tcPr>
+            <w:tcW w:w="1400" w:type="dxa"/>
+            <w:tcBorders>
+              <w:top w:val="single" w:sz="4" w:space="0" w:color="000001"/>
+              <w:start w:val="single" w:sz="4" w:space="0" w:color="000001"/>
+              <w:bottom w:val="single" w:sz="4" w:space="0" w:color="000001"/>
+              <w:end w:val="single" w:sz="4" w:space="0" w:color="000001"/>
+            </w:tcBorders>
+            <w:shd w:fill="auto" w:val="clear"/>
+          </w:tcPr>
+          <w:p>
+            <w:pPr>
+              <w:pStyle w:val="normal1"/>
+              <w:rPr/>
+            </w:pPr>
+            <w:r>
+              <w:rPr/>
+              <w:t>26/09/2026</w:t>
+            </w:r>
+          </w:p>
+        </w:tc>
+        <w:tc>
+          <w:tcPr>
+            <w:tcW w:w="4502" w:type="dxa"/>
+            <w:tcBorders>
+              <w:top w:val="single" w:sz="4" w:space="0" w:color="000001"/>
+              <w:start w:val="single" w:sz="4" w:space="0" w:color="000001"/>
+              <w:bottom w:val="single" w:sz="4" w:space="0" w:color="000001"/>
+              <w:end w:val="single" w:sz="4" w:space="0" w:color="000001"/>
+            </w:tcBorders>
+            <w:shd w:fill="auto" w:val="clear"/>
+          </w:tcPr>
+          <w:p>
+            <w:pPr>
+              <w:pStyle w:val="normal1"/>
+              <w:rPr/>
+            </w:pPr>
+            <w:r>
+              <w:rPr/>
+              <w:t>Cinco papéis iniciais, papéis somados por vínculo e papéis personalizados sem escalonamento indevido (RF0007).</w:t>
+            </w:r>
+          </w:p>
+        </w:tc>
+      </w:tr>
+      <w:tr>
+        <w:trPr/>
+        <w:tc>
+          <w:tcPr>
+            <w:tcW w:w="2400" w:type="dxa"/>
+            <w:tcBorders>
+              <w:top w:val="single" w:sz="4" w:space="0" w:color="000001"/>
+              <w:start w:val="single" w:sz="4" w:space="0" w:color="000001"/>
+              <w:bottom w:val="single" w:sz="4" w:space="0" w:color="000001"/>
+              <w:end w:val="single" w:sz="4" w:space="0" w:color="000001"/>
+            </w:tcBorders>
+            <w:shd w:fill="auto" w:val="clear"/>
+          </w:tcPr>
+          <w:p>
+            <w:pPr>
+              <w:pStyle w:val="normal1"/>
+              <w:rPr/>
+            </w:pPr>
+            <w:r>
+              <w:rPr/>
+              <w:t>Gestão da equipe</w:t>
+            </w:r>
+          </w:p>
+        </w:tc>
+        <w:tc>
+          <w:tcPr>
+            <w:tcW w:w="1900" w:type="dxa"/>
+            <w:tcBorders>
+              <w:top w:val="single" w:sz="4" w:space="0" w:color="000001"/>
+              <w:start w:val="single" w:sz="4" w:space="0" w:color="000001"/>
+              <w:bottom w:val="single" w:sz="4" w:space="0" w:color="000001"/>
+              <w:end w:val="single" w:sz="4" w:space="0" w:color="000001"/>
+            </w:tcBorders>
+            <w:shd w:fill="auto" w:val="clear"/>
+          </w:tcPr>
+          <w:p>
+            <w:pPr>
+              <w:pStyle w:val="normal1"/>
+              <w:rPr/>
+            </w:pPr>
+            <w:r>
+              <w:rPr/>
+              <w:t>Web e mobile</w:t>
+            </w:r>
+          </w:p>
+        </w:tc>
+        <w:tc>
+          <w:tcPr>
+            <w:tcW w:w="1400" w:type="dxa"/>
+            <w:tcBorders>
+              <w:top w:val="single" w:sz="4" w:space="0" w:color="000001"/>
+              <w:start w:val="single" w:sz="4" w:space="0" w:color="000001"/>
+              <w:bottom w:val="single" w:sz="4" w:space="0" w:color="000001"/>
+              <w:end w:val="single" w:sz="4" w:space="0" w:color="000001"/>
+            </w:tcBorders>
+            <w:shd w:fill="auto" w:val="clear"/>
+          </w:tcPr>
+          <w:p>
+            <w:pPr>
+              <w:pStyle w:val="normal1"/>
+              <w:rPr/>
+            </w:pPr>
+            <w:r>
+              <w:rPr/>
+              <w:t>28/09/2026</w:t>
+            </w:r>
+          </w:p>
+        </w:tc>
+        <w:tc>
+          <w:tcPr>
+            <w:tcW w:w="4502" w:type="dxa"/>
+            <w:tcBorders>
+              <w:top w:val="single" w:sz="4" w:space="0" w:color="000001"/>
+              <w:start w:val="single" w:sz="4" w:space="0" w:color="000001"/>
+              <w:bottom w:val="single" w:sz="4" w:space="0" w:color="000001"/>
+              <w:end w:val="single" w:sz="4" w:space="0" w:color="000001"/>
+            </w:tcBorders>
+            <w:shd w:fill="auto" w:val="clear"/>
+          </w:tcPr>
+          <w:p>
+            <w:pPr>
+              <w:pStyle w:val="normal1"/>
+              <w:rPr/>
+            </w:pPr>
+            <w:r>
+              <w:rPr/>
+              <w:t>Listagem e busca de profissionais e monitores, convites, troca de papéis e remoção de vínculos com confirmação.</w:t>
+            </w:r>
+          </w:p>
+        </w:tc>
+      </w:tr>
+      <w:tr>
+        <w:trPr/>
+        <w:tc>
+          <w:tcPr>
+            <w:tcW w:w="2400" w:type="dxa"/>
+            <w:tcBorders>
+              <w:top w:val="single" w:sz="4" w:space="0" w:color="000001"/>
+              <w:start w:val="single" w:sz="4" w:space="0" w:color="000001"/>
+              <w:bottom w:val="single" w:sz="4" w:space="0" w:color="000001"/>
+              <w:end w:val="single" w:sz="4" w:space="0" w:color="000001"/>
+            </w:tcBorders>
+            <w:shd w:fill="auto" w:val="clear"/>
+          </w:tcPr>
+          <w:p>
+            <w:pPr>
+              <w:pStyle w:val="normal1"/>
+              <w:rPr/>
+            </w:pPr>
+            <w:r>
+              <w:rPr/>
+              <w:t>Padrão de interface mobile</w:t>
+            </w:r>
+          </w:p>
+        </w:tc>
+        <w:tc>
+          <w:tcPr>
+            <w:tcW w:w="1900" w:type="dxa"/>
+            <w:tcBorders>
+              <w:top w:val="single" w:sz="4" w:space="0" w:color="000001"/>
+              <w:start w:val="single" w:sz="4" w:space="0" w:color="000001"/>
+              <w:bottom w:val="single" w:sz="4" w:space="0" w:color="000001"/>
+              <w:end w:val="single" w:sz="4" w:space="0" w:color="000001"/>
+            </w:tcBorders>
+            <w:shd w:fill="auto" w:val="clear"/>
+          </w:tcPr>
+          <w:p>
+            <w:pPr>
+              <w:pStyle w:val="normal1"/>
+              <w:rPr/>
+            </w:pPr>
+            <w:r>
+              <w:rPr/>
+              <w:t>Mobile</w:t>
+            </w:r>
+          </w:p>
+        </w:tc>
+        <w:tc>
+          <w:tcPr>
+            <w:tcW w:w="1400" w:type="dxa"/>
+            <w:tcBorders>
+              <w:top w:val="single" w:sz="4" w:space="0" w:color="000001"/>
+              <w:start w:val="single" w:sz="4" w:space="0" w:color="000001"/>
+              <w:bottom w:val="single" w:sz="4" w:space="0" w:color="000001"/>
+              <w:end w:val="single" w:sz="4" w:space="0" w:color="000001"/>
+            </w:tcBorders>
+            <w:shd w:fill="auto" w:val="clear"/>
+          </w:tcPr>
+          <w:p>
+            <w:pPr>
+              <w:pStyle w:val="normal1"/>
+              <w:rPr/>
+            </w:pPr>
+            <w:r>
+              <w:rPr/>
+              <w:t>29/09/2026</w:t>
+            </w:r>
+          </w:p>
+        </w:tc>
+        <w:tc>
+          <w:tcPr>
+            <w:tcW w:w="4502" w:type="dxa"/>
+            <w:tcBorders>
+              <w:top w:val="single" w:sz="4" w:space="0" w:color="000001"/>
+              <w:start w:val="single" w:sz="4" w:space="0" w:color="000001"/>
+              <w:bottom w:val="single" w:sz="4" w:space="0" w:color="000001"/>
+              <w:end w:val="single" w:sz="4" w:space="0" w:color="000001"/>
+            </w:tcBorders>
+            <w:shd w:fill="auto" w:val="clear"/>
+          </w:tcPr>
+          <w:p>
+            <w:pPr>
+              <w:pStyle w:val="normal1"/>
+              <w:rPr/>
+            </w:pPr>
+            <w:r>
+              <w:rPr/>
+              <w:t>Layout em listas, telas em pilha, avisos passageiros anunciados ao leitor de tela, ícones Phosphor e escolha de tema.</w:t>
+            </w:r>
+          </w:p>
+        </w:tc>
+      </w:tr>
+      <w:tr>
+        <w:trPr/>
+        <w:tc>
+          <w:tcPr>
+            <w:tcW w:w="2400" w:type="dxa"/>
+            <w:tcBorders>
+              <w:top w:val="single" w:sz="4" w:space="0" w:color="000001"/>
+              <w:start w:val="single" w:sz="4" w:space="0" w:color="000001"/>
+              <w:bottom w:val="single" w:sz="4" w:space="0" w:color="000001"/>
+              <w:end w:val="single" w:sz="4" w:space="0" w:color="000001"/>
+            </w:tcBorders>
+            <w:shd w:fill="auto" w:val="clear"/>
+          </w:tcPr>
+          <w:p>
+            <w:pPr>
+              <w:pStyle w:val="normal1"/>
+              <w:rPr/>
+            </w:pPr>
+            <w:r>
+              <w:rPr/>
+              <w:t>Estudantes e acompanhamentos</w:t>
+            </w:r>
+          </w:p>
+        </w:tc>
+        <w:tc>
+          <w:tcPr>
+            <w:tcW w:w="1900" w:type="dxa"/>
+            <w:tcBorders>
+              <w:top w:val="single" w:sz="4" w:space="0" w:color="000001"/>
+              <w:start w:val="single" w:sz="4" w:space="0" w:color="000001"/>
+              <w:bottom w:val="single" w:sz="4" w:space="0" w:color="000001"/>
+              <w:end w:val="single" w:sz="4" w:space="0" w:color="000001"/>
+            </w:tcBorders>
+            <w:shd w:fill="auto" w:val="clear"/>
+          </w:tcPr>
+          <w:p>
+            <w:pPr>
+              <w:pStyle w:val="normal1"/>
+              <w:rPr/>
+            </w:pPr>
+            <w:r>
+              <w:rPr/>
+              <w:t>API, web e mobile</w:t>
+            </w:r>
+          </w:p>
+        </w:tc>
+        <w:tc>
+          <w:tcPr>
+            <w:tcW w:w="1400" w:type="dxa"/>
+            <w:tcBorders>
+              <w:top w:val="single" w:sz="4" w:space="0" w:color="000001"/>
+              <w:start w:val="single" w:sz="4" w:space="0" w:color="000001"/>
+              <w:bottom w:val="single" w:sz="4" w:space="0" w:color="000001"/>
+              <w:end w:val="single" w:sz="4" w:space="0" w:color="000001"/>
+            </w:tcBorders>
+            <w:shd w:fill="auto" w:val="clear"/>
+          </w:tcPr>
+          <w:p>
+            <w:pPr>
+              <w:pStyle w:val="normal1"/>
+              <w:rPr/>
+            </w:pPr>
+            <w:r>
+              <w:rPr/>
+              <w:t>30/09/2026</w:t>
+            </w:r>
+          </w:p>
+        </w:tc>
+        <w:tc>
+          <w:tcPr>
+            <w:tcW w:w="4502" w:type="dxa"/>
+            <w:tcBorders>
+              <w:top w:val="single" w:sz="4" w:space="0" w:color="000001"/>
+              <w:start w:val="single" w:sz="4" w:space="0" w:color="000001"/>
+              <w:bottom w:val="single" w:sz="4" w:space="0" w:color="000001"/>
+              <w:end w:val="single" w:sz="4" w:space="0" w:color="000001"/>
+            </w:tcBorders>
+            <w:shd w:fill="auto" w:val="clear"/>
+          </w:tcPr>
+          <w:p>
+            <w:pPr>
+              <w:pStyle w:val="normal1"/>
+              <w:rPr/>
+            </w:pPr>
+            <w:r>
+              <w:rPr/>
+              <w:t>Cadastro civil, responsáveis, termo institucional assinado, arquivamento e definição da equipe que acompanha cada estudante (RF0008).</w:t>
+            </w:r>
+          </w:p>
+        </w:tc>
+      </w:tr>
+      <w:tr>
+        <w:trPr/>
+        <w:tc>
+          <w:tcPr>
+            <w:tcW w:w="2400" w:type="dxa"/>
+            <w:tcBorders>
+              <w:top w:val="single" w:sz="4" w:space="0" w:color="000001"/>
+              <w:start w:val="single" w:sz="4" w:space="0" w:color="000001"/>
+              <w:bottom w:val="single" w:sz="4" w:space="0" w:color="000001"/>
+              <w:end w:val="single" w:sz="4" w:space="0" w:color="000001"/>
+            </w:tcBorders>
+            <w:shd w:fill="auto" w:val="clear"/>
+          </w:tcPr>
+          <w:p>
+            <w:pPr>
+              <w:pStyle w:val="normal1"/>
+              <w:rPr/>
+            </w:pPr>
+            <w:r>
+              <w:rPr/>
+              <w:t>Ficha do estudante</w:t>
+            </w:r>
+          </w:p>
+        </w:tc>
+        <w:tc>
+          <w:tcPr>
+            <w:tcW w:w="1900" w:type="dxa"/>
+            <w:tcBorders>
+              <w:top w:val="single" w:sz="4" w:space="0" w:color="000001"/>
+              <w:start w:val="single" w:sz="4" w:space="0" w:color="000001"/>
+              <w:bottom w:val="single" w:sz="4" w:space="0" w:color="000001"/>
+              <w:end w:val="single" w:sz="4" w:space="0" w:color="000001"/>
+            </w:tcBorders>
+            <w:shd w:fill="auto" w:val="clear"/>
+          </w:tcPr>
+          <w:p>
+            <w:pPr>
+              <w:pStyle w:val="normal1"/>
+              <w:rPr/>
+            </w:pPr>
+            <w:r>
+              <w:rPr/>
+              <w:t>API, web e mobile</w:t>
+            </w:r>
+          </w:p>
+        </w:tc>
+        <w:tc>
+          <w:tcPr>
+            <w:tcW w:w="1400" w:type="dxa"/>
+            <w:tcBorders>
+              <w:top w:val="single" w:sz="4" w:space="0" w:color="000001"/>
+              <w:start w:val="single" w:sz="4" w:space="0" w:color="000001"/>
+              <w:bottom w:val="single" w:sz="4" w:space="0" w:color="000001"/>
+              <w:end w:val="single" w:sz="4" w:space="0" w:color="000001"/>
+            </w:tcBorders>
+            <w:shd w:fill="auto" w:val="clear"/>
+          </w:tcPr>
+          <w:p>
+            <w:pPr>
+              <w:pStyle w:val="normal1"/>
+              <w:rPr/>
+            </w:pPr>
+            <w:r>
+              <w:rPr/>
+              <w:t>30/09/2026</w:t>
+            </w:r>
+          </w:p>
+        </w:tc>
+        <w:tc>
+          <w:tcPr>
+            <w:tcW w:w="4502" w:type="dxa"/>
+            <w:tcBorders>
+              <w:top w:val="single" w:sz="4" w:space="0" w:color="000001"/>
+              <w:start w:val="single" w:sz="4" w:space="0" w:color="000001"/>
+              <w:bottom w:val="single" w:sz="4" w:space="0" w:color="000001"/>
+              <w:end w:val="single" w:sz="4" w:space="0" w:color="000001"/>
+            </w:tcBorders>
+            <w:shd w:fill="auto" w:val="clear"/>
+          </w:tcPr>
+          <w:p>
+            <w:pPr>
+              <w:pStyle w:val="normal1"/>
+              <w:rPr/>
+            </w:pPr>
+            <w:r>
+              <w:rPr/>
+              <w:t>Ficha com histórico de revisões, observações e consultas realizadas que não podem ser alteradas depois de registradas (RF0009).</w:t>
+            </w:r>
+          </w:p>
+        </w:tc>
+      </w:tr>
+      <w:tr>
+        <w:trPr/>
+        <w:tc>
+          <w:tcPr>
+            <w:tcW w:w="2400" w:type="dxa"/>
+            <w:tcBorders>
+              <w:top w:val="single" w:sz="4" w:space="0" w:color="000001"/>
+              <w:start w:val="single" w:sz="4" w:space="0" w:color="000001"/>
+              <w:bottom w:val="single" w:sz="4" w:space="0" w:color="000001"/>
+              <w:end w:val="single" w:sz="4" w:space="0" w:color="000001"/>
+            </w:tcBorders>
+            <w:shd w:fill="auto" w:val="clear"/>
+          </w:tcPr>
+          <w:p>
+            <w:pPr>
+              <w:pStyle w:val="normal1"/>
+              <w:rPr/>
+            </w:pPr>
+            <w:r>
+              <w:rPr/>
+              <w:t>Consentimento e rotina semanal</w:t>
+            </w:r>
+          </w:p>
+        </w:tc>
+        <w:tc>
+          <w:tcPr>
+            <w:tcW w:w="1900" w:type="dxa"/>
+            <w:tcBorders>
+              <w:top w:val="single" w:sz="4" w:space="0" w:color="000001"/>
+              <w:start w:val="single" w:sz="4" w:space="0" w:color="000001"/>
+              <w:bottom w:val="single" w:sz="4" w:space="0" w:color="000001"/>
+              <w:end w:val="single" w:sz="4" w:space="0" w:color="000001"/>
+            </w:tcBorders>
+            <w:shd w:fill="auto" w:val="clear"/>
+          </w:tcPr>
+          <w:p>
+            <w:pPr>
+              <w:pStyle w:val="normal1"/>
+              <w:rPr/>
+            </w:pPr>
+            <w:r>
+              <w:rPr/>
+              <w:t>API, web e mobile</w:t>
+            </w:r>
+          </w:p>
+        </w:tc>
+        <w:tc>
+          <w:tcPr>
+            <w:tcW w:w="1400" w:type="dxa"/>
+            <w:tcBorders>
+              <w:top w:val="single" w:sz="4" w:space="0" w:color="000001"/>
+              <w:start w:val="single" w:sz="4" w:space="0" w:color="000001"/>
+              <w:bottom w:val="single" w:sz="4" w:space="0" w:color="000001"/>
+              <w:end w:val="single" w:sz="4" w:space="0" w:color="000001"/>
+            </w:tcBorders>
+            <w:shd w:fill="auto" w:val="clear"/>
+          </w:tcPr>
+          <w:p>
+            <w:pPr>
+              <w:pStyle w:val="normal1"/>
+              <w:rPr/>
+            </w:pPr>
+            <w:r>
+              <w:rPr/>
+              <w:t>30/09/2026</w:t>
+            </w:r>
+          </w:p>
+        </w:tc>
+        <w:tc>
+          <w:tcPr>
+            <w:tcW w:w="4502" w:type="dxa"/>
+            <w:tcBorders>
+              <w:top w:val="single" w:sz="4" w:space="0" w:color="000001"/>
+              <w:start w:val="single" w:sz="4" w:space="0" w:color="000001"/>
+              <w:bottom w:val="single" w:sz="4" w:space="0" w:color="000001"/>
+              <w:end w:val="single" w:sz="4" w:space="0" w:color="000001"/>
+            </w:tcBorders>
+            <w:shd w:fill="auto" w:val="clear"/>
+          </w:tcPr>
+          <w:p>
+            <w:pPr>
+              <w:pStyle w:val="normal1"/>
+              <w:rPr/>
+            </w:pPr>
+            <w:r>
+              <w:rPr/>
+              <w:t>O responsável confirma e revoga o consentimento registrado pela instituição; a equipe monta a grade semanal do aluno, que aluno e responsável consultam na aba Rotina (RF0010, parcial).</w:t>
+            </w:r>
+          </w:p>
+        </w:tc>
+      </w:tr>
+    </w:tbl>
+    <w:p>
+      <w:pPr>
+        <w:pStyle w:val="normal1"/>
+        <w:keepNext w:val="false"/>
+        <w:keepLines w:val="false"/>
+        <w:pageBreakBefore w:val="false"/>
+        <w:widowControl/>
+        <w:pBdr/>
+        <w:shd w:val="clear" w:fill="auto"/>
+        <w:spacing w:lineRule="auto" w:line="300" w:before="0" w:after="0"/>
+        <w:ind w:firstLine="720" w:start="0" w:end="0"/>
+        <w:jc w:val="both"/>
+        <w:rPr/>
+      </w:pPr>
+      <w:r>
+        <w:rPr/>
+      </w:r>
+    </w:p>
+    <w:p>
+      <w:pPr>
+        <w:pStyle w:val="normal1"/>
+        <w:keepNext w:val="false"/>
+        <w:keepLines w:val="false"/>
+        <w:pageBreakBefore w:val="false"/>
+        <w:widowControl/>
+        <w:pBdr/>
+        <w:shd w:val="clear" w:fill="auto"/>
+        <w:spacing w:lineRule="auto" w:line="300" w:before="0" w:after="0"/>
+        <w:ind w:firstLine="720" w:start="0" w:end="0"/>
+        <w:jc w:val="both"/>
+        <w:rPr/>
+      </w:pPr>
+      <w:r>
+        <w:rPr/>
+        <w:t xml:space="preserve">Resultado: os requisitos RF0002 a RF0009 e RF0014 estão implementados, e a grade semanal do RF0010 já está disponível. Ficam para as próximas sprints as tarefas do aluno, o uso sem conexão, a agenda de atendimentos, as métricas, os relatórios, a recuperação de senha e a trilha de auditoria.</w:t>
       </w:r>
       <w:r>
         <w:br w:type="page"/>

</xml_diff>

<commit_message>
docs(docs): document guardian consent and weekly routine
Co-Authored-By: Claude Opus 5.5 <noreply@anthropic.com>
</commit_message>
<xml_diff>
--- a/documentacao_habituar.docx
+++ b/documentacao_habituar.docx
@@ -3059,7 +3059,7 @@
             </w:pPr>
             <w:r>
               <w:rPr/>
-              <w:t>O aluno deve montar a grade semanal, receber tarefas e acompanhar entregas e avaliações.</w:t>
+              <w:t xml:space="preserve">O aluno deve montar a grade semanal, receber tarefas e acompanhar entregas e avaliações. A grade semanal já existe: a equipe que acompanha o aluno monta, na ficha, os blocos de cada dia (horário, título, tipo e observação), e o aluno e o responsável veem a semana na aba Rotina, com o dia de hoje em destaque. Tarefas, entregas, avaliações e o uso sem conexão ainda estão previstos.</w:t>
             </w:r>
           </w:p>
         </w:tc>
@@ -3260,7 +3260,7 @@
             </w:pPr>
             <w:r>
               <w:rPr/>
-              <w:t>Previsto</w:t>
+              <w:t xml:space="preserve">Em desenvolvimento</w:t>
             </w:r>
           </w:p>
         </w:tc>
@@ -3282,7 +3282,7 @@
             </w:pPr>
             <w:r>
               <w:rPr/>
-              <w:t>Futura</w:t>
+              <w:t xml:space="preserve">Atual</w:t>
             </w:r>
           </w:p>
         </w:tc>
@@ -5120,7 +5120,7 @@
             </w:pPr>
             <w:r>
               <w:rPr/>
-              <w:t>Dados pessoais e sensíveis devem ser tratados conforme a LGPD e o princípio do menor acesso.</w:t>
+              <w:t xml:space="preserve">Dados pessoais e sensíveis devem ser tratados conforme a LGPD e o princípio do menor acesso. O responsável confirma e revoga, pela web e pelo aplicativo, o consentimento que a instituição registrou para o estudante; o texto do termo exibido é um resumo provisório, pendente de revisão jurídica.</w:t>
             </w:r>
           </w:p>
         </w:tc>
@@ -8128,7 +8128,7 @@
       </w:pPr>
       <w:r>
         <w:rPr/>
-        <w:t xml:space="preserve">O modelo abaixo representa as entidades atualmente implementadas. Usuários e sessões são globais; vínculos, papéis, permissões, convites, estudantes, responsáveis e atribuições preservam o contexto institucional. Cada vínculo possui um tipo e recebe papéis por membership_roles; os papéis de sistema possuem template_key. Convites guardam somente o hash do token e seus papéis ficam em invitation_roles. Vínculos removidos recebem data e autor da remoção, sem apagar a conta nem a autoria de registros, e vínculos e papéis têm versão para recusar edição feita sobre dados desatualizados. O estudante pode ser cadastrado sem conta própria; seus responsáveis ficam em student_guardians, os consentimentos em student_consents e cada acompanhamento liga um vínculo ativo de profissional ou monitor ao estudante. A ficha do estudante fica em student_profile_revisions, uma revisão por gravação, as observações em student_observations e as consultas realizadas em student_consultations; as três tabelas aceitam somente leitura e inserção, com autoria igual à pessoa autenticada. As tabelas de responsáveis, consentimentos e ficha ainda não aparecem no diagrama. O banco aplica isolamento por linha para impedir acesso entre instituições.</w:t>
+        <w:t xml:space="preserve">O modelo abaixo representa as entidades atualmente implementadas. Usuários e sessões são globais; vínculos, papéis, permissões, convites, estudantes, responsáveis e atribuições preservam o contexto institucional. Cada vínculo possui um tipo e recebe papéis por membership_roles; os papéis de sistema possuem template_key. Convites guardam somente o hash do token e seus papéis ficam em invitation_roles. Vínculos removidos recebem data e autor da remoção, sem apagar a conta nem a autoria de registros, e vínculos e papéis têm versão para recusar edição feita sobre dados desatualizados. O estudante pode ser cadastrado sem conta própria; seus responsáveis ficam em student_guardians, os consentimentos em student_consents e cada acompanhamento liga um vínculo ativo de profissional ou monitor ao estudante. A ficha do estudante fica em student_profile_revisions, uma revisão por gravação, as observações em student_observations e as consultas realizadas em student_consultations; as três tabelas aceitam somente leitura e inserção, com autoria igual à pessoa autenticada. A grade semanal do aluno fica em routine_blocks, com versão para recusar edição feita sobre dados desatualizados. As tabelas de responsáveis, consentimentos, ficha e rotina ainda não aparecem no diagrama. O banco aplica isolamento por linha para impedir acesso entre instituições.</w:t>
       </w:r>
     </w:p>
     <w:p>
@@ -8196,7 +8196,7 @@
       </w:pPr>
       <w:r>
         <w:rPr/>
-        <w:t xml:space="preserve">Entidades previstas para evolução do produto incluem rotina, tarefas, agenda de consultas, métricas, grupos e relatórios. Elas ainda não fazem parte do modelo físico apresentado.</w:t>
+        <w:t xml:space="preserve">Entidades previstas para evolução do produto incluem tarefas, agenda de consultas, métricas, grupos e relatórios. Elas ainda não fazem parte do modelo físico apresentado.</w:t>
       </w:r>
     </w:p>
     <w:p>
@@ -10839,7 +10839,7 @@
             </w:pPr>
             <w:r>
               <w:rPr/>
-              <w:t>Previsto</w:t>
+              <w:t xml:space="preserve">Em desenvolvimento</w:t>
             </w:r>
           </w:p>
         </w:tc>
@@ -10861,7 +10861,7 @@
             </w:pPr>
             <w:r>
               <w:rPr/>
-              <w:t>Organização semanal e funcionamento offline</w:t>
+              <w:t xml:space="preserve">Grade semanal pronta; tarefas, foco e offline previstos</w:t>
             </w:r>
           </w:p>
         </w:tc>

</xml_diff>